<commit_message>
Added documents and corrected a naminng numbering issue.
</commit_message>
<xml_diff>
--- a/01_Standards/Milestone_3_Components/M3_EI_Table_Names_&_Assignments.docx
+++ b/01_Standards/Milestone_3_Components/M3_EI_Table_Names_&_Assignments.docx
@@ -308,28 +308,7 @@
                 <w:rFonts w:ascii="Consolas" w:hAnsi="Consolas" w:cs="Calibri"/>
                 <w:szCs w:val="24"/>
               </w:rPr>
-              <w:t>Figure 1.</w:t>
-            </w:r>
-            <w:r>
-              <w:rPr>
-                <w:rFonts w:ascii="Consolas" w:hAnsi="Consolas" w:cs="Calibri"/>
-                <w:szCs w:val="24"/>
-              </w:rPr>
-              <w:t xml:space="preserve">14 </w:t>
-            </w:r>
-            <w:r>
-              <w:rPr>
-                <w:rFonts w:ascii="Consolas" w:hAnsi="Consolas" w:cs="Calibri"/>
-                <w:szCs w:val="24"/>
-              </w:rPr>
-              <w:t xml:space="preserve">= </w:t>
-            </w:r>
-            <w:r>
-              <w:rPr>
-                <w:rFonts w:ascii="Consolas" w:hAnsi="Consolas" w:cs="Calibri"/>
-                <w:szCs w:val="24"/>
-              </w:rPr>
-              <w:t>3</w:t>
+              <w:t>Figure 1.14 = 3</w:t>
             </w:r>
           </w:p>
           <w:p>
@@ -345,28 +324,7 @@
                 <w:rFonts w:ascii="Consolas" w:hAnsi="Consolas" w:cs="Calibri"/>
                 <w:szCs w:val="24"/>
               </w:rPr>
-              <w:t>Figure 1.</w:t>
-            </w:r>
-            <w:r>
-              <w:rPr>
-                <w:rFonts w:ascii="Consolas" w:hAnsi="Consolas" w:cs="Calibri"/>
-                <w:szCs w:val="24"/>
-              </w:rPr>
-              <w:t xml:space="preserve">15 </w:t>
-            </w:r>
-            <w:r>
-              <w:rPr>
-                <w:rFonts w:ascii="Consolas" w:hAnsi="Consolas" w:cs="Calibri"/>
-                <w:szCs w:val="24"/>
-              </w:rPr>
-              <w:t xml:space="preserve">= </w:t>
-            </w:r>
-            <w:r>
-              <w:rPr>
-                <w:rFonts w:ascii="Consolas" w:hAnsi="Consolas" w:cs="Calibri"/>
-                <w:szCs w:val="24"/>
-              </w:rPr>
-              <w:t>3</w:t>
+              <w:t>Figure 1.15 = 3</w:t>
             </w:r>
           </w:p>
           <w:p>
@@ -451,28 +409,7 @@
                 <w:rFonts w:ascii="Consolas" w:hAnsi="Consolas" w:cs="Calibri"/>
                 <w:szCs w:val="24"/>
               </w:rPr>
-              <w:t xml:space="preserve">Total      </w:t>
-            </w:r>
-            <w:r>
-              <w:rPr>
-                <w:rFonts w:ascii="Consolas" w:hAnsi="Consolas" w:cs="Calibri"/>
-                <w:szCs w:val="24"/>
-              </w:rPr>
-              <w:t xml:space="preserve"> </w:t>
-            </w:r>
-            <w:r>
-              <w:rPr>
-                <w:rFonts w:ascii="Consolas" w:hAnsi="Consolas" w:cs="Calibri"/>
-                <w:szCs w:val="24"/>
-              </w:rPr>
-              <w:t>=</w:t>
-            </w:r>
-            <w:r>
-              <w:rPr>
-                <w:rFonts w:ascii="Consolas" w:hAnsi="Consolas" w:cs="Calibri"/>
-                <w:szCs w:val="24"/>
-              </w:rPr>
-              <w:t xml:space="preserve"> </w:t>
+              <w:t xml:space="preserve">Total       = </w:t>
             </w:r>
             <w:r>
               <w:rPr>
@@ -539,10 +476,7 @@
             </w:r>
             <w:proofErr w:type="gramEnd"/>
             <w:r>
-              <w:t xml:space="preserve"> Search Orchestrator</w:t>
-            </w:r>
-            <w:r>
-              <w:t xml:space="preserve"> </w:t>
+              <w:t xml:space="preserve"> Search Orchestrator </w:t>
             </w:r>
             <w:r>
               <w:t>Search Service</w:t>
@@ -649,14 +583,7 @@
                 <w:rFonts w:ascii="Consolas" w:hAnsi="Consolas" w:cs="Calibri"/>
                 <w:szCs w:val="24"/>
               </w:rPr>
-              <w:t>1.</w:t>
-            </w:r>
-            <w:r>
-              <w:rPr>
-                <w:rFonts w:ascii="Consolas" w:hAnsi="Consolas" w:cs="Calibri"/>
-                <w:szCs w:val="24"/>
-              </w:rPr>
-              <w:t xml:space="preserve">9 </w:t>
+              <w:t xml:space="preserve">1.9 </w:t>
             </w:r>
             <w:r>
               <w:rPr>
@@ -678,14 +605,7 @@
                 <w:rFonts w:ascii="Consolas" w:hAnsi="Consolas" w:cs="Calibri"/>
                 <w:szCs w:val="24"/>
               </w:rPr>
-              <w:t xml:space="preserve"> </w:t>
-            </w:r>
-            <w:r>
-              <w:rPr>
-                <w:rFonts w:ascii="Consolas" w:hAnsi="Consolas" w:cs="Calibri"/>
-                <w:szCs w:val="24"/>
-              </w:rPr>
-              <w:t>1</w:t>
+              <w:t xml:space="preserve"> 1</w:t>
             </w:r>
             <w:r>
               <w:rPr>
@@ -707,42 +627,7 @@
                 <w:rFonts w:ascii="Consolas" w:hAnsi="Consolas" w:cs="Calibri"/>
                 <w:szCs w:val="24"/>
               </w:rPr>
-              <w:t xml:space="preserve">Total    </w:t>
-            </w:r>
-            <w:r>
-              <w:rPr>
-                <w:rFonts w:ascii="Consolas" w:hAnsi="Consolas" w:cs="Calibri"/>
-                <w:szCs w:val="24"/>
-              </w:rPr>
-              <w:t xml:space="preserve"> </w:t>
-            </w:r>
-            <w:r>
-              <w:rPr>
-                <w:rFonts w:ascii="Consolas" w:hAnsi="Consolas" w:cs="Calibri"/>
-                <w:szCs w:val="24"/>
-              </w:rPr>
-              <w:t xml:space="preserve"> </w:t>
-            </w:r>
-            <w:r>
-              <w:rPr>
-                <w:rFonts w:ascii="Consolas" w:hAnsi="Consolas" w:cs="Calibri"/>
-                <w:szCs w:val="24"/>
-              </w:rPr>
-              <w:t xml:space="preserve"> </w:t>
-            </w:r>
-            <w:r>
-              <w:rPr>
-                <w:rFonts w:ascii="Consolas" w:hAnsi="Consolas" w:cs="Calibri"/>
-                <w:szCs w:val="24"/>
-              </w:rPr>
-              <w:t xml:space="preserve">= </w:t>
-            </w:r>
-            <w:r>
-              <w:rPr>
-                <w:rFonts w:ascii="Consolas" w:hAnsi="Consolas" w:cs="Calibri"/>
-                <w:szCs w:val="24"/>
-              </w:rPr>
-              <w:t>1</w:t>
+              <w:t>Total       = 1</w:t>
             </w:r>
             <w:r>
               <w:rPr>
@@ -886,15 +771,9 @@
                 <w:rFonts w:ascii="Consolas" w:hAnsi="Consolas" w:cs="Calibri"/>
                 <w:szCs w:val="24"/>
               </w:rPr>
-              <w:t>1.</w:t>
-            </w:r>
-            <w:r>
-              <w:rPr>
-                <w:rFonts w:ascii="Consolas" w:hAnsi="Consolas" w:cs="Calibri"/>
-                <w:szCs w:val="24"/>
-              </w:rPr>
-              <w:t>4</w:t>
-            </w:r>
+              <w:t>1.4  =</w:t>
+            </w:r>
+            <w:proofErr w:type="gramEnd"/>
             <w:r>
               <w:rPr>
                 <w:rFonts w:ascii="Consolas" w:hAnsi="Consolas" w:cs="Calibri"/>
@@ -907,28 +786,6 @@
                 <w:rFonts w:ascii="Consolas" w:hAnsi="Consolas" w:cs="Calibri"/>
                 <w:szCs w:val="24"/>
               </w:rPr>
-              <w:t xml:space="preserve"> </w:t>
-            </w:r>
-            <w:r>
-              <w:rPr>
-                <w:rFonts w:ascii="Consolas" w:hAnsi="Consolas" w:cs="Calibri"/>
-                <w:szCs w:val="24"/>
-              </w:rPr>
-              <w:t>=</w:t>
-            </w:r>
-            <w:proofErr w:type="gramEnd"/>
-            <w:r>
-              <w:rPr>
-                <w:rFonts w:ascii="Consolas" w:hAnsi="Consolas" w:cs="Calibri"/>
-                <w:szCs w:val="24"/>
-              </w:rPr>
-              <w:t xml:space="preserve"> </w:t>
-            </w:r>
-            <w:r>
-              <w:rPr>
-                <w:rFonts w:ascii="Consolas" w:hAnsi="Consolas" w:cs="Calibri"/>
-                <w:szCs w:val="24"/>
-              </w:rPr>
               <w:t>6</w:t>
             </w:r>
           </w:p>
@@ -954,28 +811,7 @@
                 <w:rFonts w:ascii="Consolas" w:hAnsi="Consolas" w:cs="Calibri"/>
                 <w:szCs w:val="24"/>
               </w:rPr>
-              <w:t>Figure 1.</w:t>
-            </w:r>
-            <w:r>
-              <w:rPr>
-                <w:rFonts w:ascii="Consolas" w:hAnsi="Consolas" w:cs="Calibri"/>
-                <w:szCs w:val="24"/>
-              </w:rPr>
-              <w:t>10</w:t>
-            </w:r>
-            <w:r>
-              <w:rPr>
-                <w:rFonts w:ascii="Consolas" w:hAnsi="Consolas" w:cs="Calibri"/>
-                <w:szCs w:val="24"/>
-              </w:rPr>
-              <w:t xml:space="preserve"> = </w:t>
-            </w:r>
-            <w:r>
-              <w:rPr>
-                <w:rFonts w:ascii="Consolas" w:hAnsi="Consolas" w:cs="Calibri"/>
-                <w:szCs w:val="24"/>
-              </w:rPr>
-              <w:t>8</w:t>
+              <w:t>Figure 1.10 = 8</w:t>
             </w:r>
           </w:p>
           <w:p>
@@ -1005,14 +841,7 @@
                 <w:rFonts w:ascii="Consolas" w:hAnsi="Consolas" w:cs="Calibri"/>
                 <w:szCs w:val="24"/>
               </w:rPr>
-              <w:t xml:space="preserve">Total       = </w:t>
-            </w:r>
-            <w:r>
-              <w:rPr>
-                <w:rFonts w:ascii="Consolas" w:hAnsi="Consolas" w:cs="Calibri"/>
-                <w:szCs w:val="24"/>
-              </w:rPr>
-              <w:t>2</w:t>
+              <w:t>Total       = 2</w:t>
             </w:r>
             <w:r>
               <w:rPr>
@@ -1376,14 +1205,7 @@
                 <w:rFonts w:ascii="Consolas" w:hAnsi="Consolas" w:cs="Calibri"/>
                 <w:szCs w:val="24"/>
               </w:rPr>
-              <w:t>=</w:t>
-            </w:r>
-            <w:r>
-              <w:rPr>
-                <w:rFonts w:ascii="Consolas" w:hAnsi="Consolas" w:cs="Calibri"/>
-                <w:szCs w:val="24"/>
-              </w:rPr>
-              <w:t xml:space="preserve"> </w:t>
+              <w:t xml:space="preserve">= </w:t>
             </w:r>
             <w:r>
               <w:rPr>
@@ -1460,10 +1282,7 @@
               <w:t>Analytics</w:t>
             </w:r>
             <w:r>
-              <w:t xml:space="preserve"> </w:t>
-            </w:r>
-            <w:r>
-              <w:t>Services</w:t>
+              <w:t xml:space="preserve"> Services</w:t>
             </w:r>
             <w:r>
               <w:t xml:space="preserve"> </w:t>
@@ -1683,14 +1502,7 @@
                 <w:rFonts w:ascii="Consolas" w:hAnsi="Consolas" w:cs="Calibri"/>
                 <w:szCs w:val="24"/>
               </w:rPr>
-              <w:t>12</w:t>
-            </w:r>
-            <w:r>
-              <w:rPr>
-                <w:rFonts w:ascii="Consolas" w:hAnsi="Consolas" w:cs="Calibri"/>
-                <w:szCs w:val="24"/>
-              </w:rPr>
-              <w:t xml:space="preserve"> </w:t>
+              <w:t xml:space="preserve">12 </w:t>
             </w:r>
             <w:r>
               <w:rPr>
@@ -1727,14 +1539,7 @@
                 <w:rFonts w:ascii="Consolas" w:hAnsi="Consolas" w:cs="Calibri"/>
                 <w:szCs w:val="24"/>
               </w:rPr>
-              <w:t>13</w:t>
-            </w:r>
-            <w:r>
-              <w:rPr>
-                <w:rFonts w:ascii="Consolas" w:hAnsi="Consolas" w:cs="Calibri"/>
-                <w:szCs w:val="24"/>
-              </w:rPr>
-              <w:t xml:space="preserve"> </w:t>
+              <w:t xml:space="preserve">13 </w:t>
             </w:r>
             <w:r>
               <w:rPr>
@@ -1831,10 +1636,7 @@
               <w:t>Recommendation</w:t>
             </w:r>
             <w:r>
-              <w:t xml:space="preserve"> </w:t>
-            </w:r>
-            <w:r>
-              <w:t>Services</w:t>
+              <w:t xml:space="preserve"> Services</w:t>
             </w:r>
             <w:r>
               <w:t xml:space="preserve"> </w:t>
@@ -2053,14 +1855,7 @@
                 <w:rFonts w:ascii="Consolas" w:hAnsi="Consolas" w:cs="Calibri"/>
                 <w:szCs w:val="24"/>
               </w:rPr>
-              <w:t>11</w:t>
-            </w:r>
-            <w:r>
-              <w:rPr>
-                <w:rFonts w:ascii="Consolas" w:hAnsi="Consolas" w:cs="Calibri"/>
-                <w:szCs w:val="24"/>
-              </w:rPr>
-              <w:t xml:space="preserve"> </w:t>
+              <w:t xml:space="preserve">11 </w:t>
             </w:r>
             <w:r>
               <w:rPr>
@@ -2110,6 +1905,7 @@
     </w:tbl>
     <w:p>
       <w:r>
+        <w:lastRenderedPageBreak/>
         <w:t xml:space="preserve">69 </w:t>
       </w:r>
       <w:r>
@@ -2125,7 +1921,7 @@
         <w:t>"</w:t>
       </w:r>
       <w:r>
-        <w:t>EI Table 1.4.5 — Service Orchestrator Pattern</w:t>
+        <w:t>EI Pattern Table (1.4.5–1.4.12) — Service Orchestrator Pattern</w:t>
       </w:r>
       <w:r>
         <w:t>"</w:t>
@@ -2166,19 +1962,37 @@
         <w:t>"</w:t>
       </w:r>
       <w:r>
-        <w:t>EI Table 1.4.6 — Profile Orchestrator</w:t>
+        <w:t>EI Table 1.4.</w:t>
+      </w:r>
+      <w:r>
+        <w:t>5</w:t>
+      </w:r>
+      <w:r>
+        <w:t xml:space="preserve"> — Profile Orchestrator</w:t>
       </w:r>
       <w:r>
         <w:t>," " "</w:t>
       </w:r>
       <w:r>
-        <w:t>EI Table 1.4.7 — Resume Orchestrator</w:t>
+        <w:t>EI Table 1.4.</w:t>
+      </w:r>
+      <w:r>
+        <w:t>6</w:t>
+      </w:r>
+      <w:r>
+        <w:t xml:space="preserve"> — Resume Orchestrator</w:t>
       </w:r>
       <w:r>
         <w:t>, "</w:t>
       </w:r>
       <w:r>
-        <w:t>EI Table 1.4.8 — Job Orchestrator</w:t>
+        <w:t>EI Table 1.4.</w:t>
+      </w:r>
+      <w:r>
+        <w:t>7</w:t>
+      </w:r>
+      <w:r>
+        <w:t xml:space="preserve"> — Job Orchestrator</w:t>
       </w:r>
       <w:r>
         <w:t>"</w:t>
@@ -2190,7 +2004,13 @@
         <w:t>"</w:t>
       </w:r>
       <w:r>
-        <w:t>EI Table 1.4.9 — Search Orchestrato</w:t>
+        <w:t>EI Table 1.4.</w:t>
+      </w:r>
+      <w:r>
+        <w:t>8</w:t>
+      </w:r>
+      <w:r>
+        <w:t xml:space="preserve"> — Search Orchestrato</w:t>
       </w:r>
       <w:r>
         <w:t>r</w:t>
@@ -2208,7 +2028,13 @@
         <w:t>"</w:t>
       </w:r>
       <w:r>
-        <w:t>EI Table 1.4.10 — Communications Orchestrator</w:t>
+        <w:t>EI Table 1.4.</w:t>
+      </w:r>
+      <w:r>
+        <w:t>9</w:t>
+      </w:r>
+      <w:r>
+        <w:t xml:space="preserve"> — Communications Orchestrator</w:t>
       </w:r>
       <w:r>
         <w:t>,</w:t>
@@ -2223,52 +2049,1366 @@
         <w:t>"</w:t>
       </w:r>
       <w:r>
-        <w:t>EI Table 1.4.11 — Recommendation Orchestrator</w:t>
-      </w:r>
-      <w:r>
-        <w:t xml:space="preserve">," </w:t>
+        <w:t>EI Table 1.4.1</w:t>
+      </w:r>
+      <w:r>
+        <w:t>0</w:t>
+      </w:r>
+      <w:r>
+        <w:t xml:space="preserve"> — Recommendation Orchestrator</w:t>
+      </w:r>
+      <w:r>
+        <w:t>," "</w:t>
+      </w:r>
+      <w:r>
+        <w:t>EI Table 1.4.1</w:t>
+      </w:r>
+      <w:r>
+        <w:t>2</w:t>
+      </w:r>
+      <w:r>
+        <w:t xml:space="preserve"> — External Services Orchestrator</w:t>
+      </w:r>
+      <w:r>
+        <w:t>," and "</w:t>
+      </w:r>
+      <w:r>
+        <w:t>EI Table 1.4.1</w:t>
+      </w:r>
+      <w:r>
+        <w:t>2</w:t>
+      </w:r>
+      <w:r>
+        <w:t xml:space="preserve"> — Analytics Orchestrator</w:t>
       </w:r>
       <w:r>
         <w:t>"</w:t>
       </w:r>
       <w:r>
+        <w:t xml:space="preserve">). </w:t>
+      </w:r>
+      <w:r>
+        <w:t>Each team is to place t</w:t>
+      </w:r>
+      <w:r>
+        <w:t xml:space="preserve">hese domain-specific EITs under the </w:t>
+      </w:r>
+      <w:r>
+        <w:t>heading of "</w:t>
+      </w:r>
+      <w:r>
+        <w:t>Entity Identification Tables — API Gateway / Orchestrator</w:t>
+      </w:r>
+      <w:r>
+        <w:t>".</w:t>
+      </w:r>
+    </w:p>
+    <w:p>
+      <w:pPr>
+        <w:pStyle w:val="Alt1-Hd-2"/>
+      </w:pPr>
+      <w:r>
+        <w:t>Team 1 (Danny Capps)</w:t>
+      </w:r>
+      <w:r>
+        <w:t xml:space="preserve"> - Total </w:t>
+      </w:r>
+      <w:r>
+        <w:t xml:space="preserve">Entity Identification Tables </w:t>
+      </w:r>
+      <w:r>
+        <w:t>Count (</w:t>
+      </w:r>
+      <w:r>
+        <w:t>13</w:t>
+      </w:r>
+      <w:r>
+        <w:t>)</w:t>
+      </w:r>
+    </w:p>
+    <w:p>
+      <w:pPr>
+        <w:pStyle w:val="ListParagraph"/>
+        <w:numPr>
+          <w:ilvl w:val="0"/>
+          <w:numId w:val="2"/>
+        </w:numPr>
+      </w:pPr>
+      <w:r>
+        <w:t>Entity Identification Tables — API Gateway / Orchestrator (</w:t>
+      </w:r>
+      <w:r>
+        <w:t>1</w:t>
+      </w:r>
+      <w:r>
+        <w:t xml:space="preserve"> Inner Components)</w:t>
+      </w:r>
+    </w:p>
+    <w:p>
+      <w:pPr>
+        <w:pStyle w:val="ListParagraph"/>
+        <w:numPr>
+          <w:ilvl w:val="1"/>
+          <w:numId w:val="2"/>
+        </w:numPr>
+      </w:pPr>
+      <w:r>
+        <w:t>EI Table 1.4.</w:t>
+      </w:r>
+      <w:r>
+        <w:t>7</w:t>
+      </w:r>
+      <w:r>
+        <w:t xml:space="preserve"> — </w:t>
+      </w:r>
+      <w:r>
+        <w:t>Job Orchestrator</w:t>
+      </w:r>
+    </w:p>
+    <w:p>
+      <w:pPr>
+        <w:pStyle w:val="ListParagraph"/>
+        <w:numPr>
+          <w:ilvl w:val="2"/>
+          <w:numId w:val="2"/>
+        </w:numPr>
+      </w:pPr>
+      <w:r>
+        <w:t>domain-specific entities</w:t>
+      </w:r>
+      <w:r>
+        <w:t xml:space="preserve"> in (</w:t>
+      </w:r>
+      <w:r>
+        <w:t>API Gateway / Orchestrator</w:t>
+      </w:r>
+      <w:r>
+        <w:t>)</w:t>
+      </w:r>
+    </w:p>
+    <w:p>
+      <w:pPr>
+        <w:pStyle w:val="ListParagraph"/>
+        <w:numPr>
+          <w:ilvl w:val="0"/>
+          <w:numId w:val="2"/>
+        </w:numPr>
+      </w:pPr>
+      <w:r>
+        <w:t>Entity Identification Tables — Job Posting Service</w:t>
+      </w:r>
+      <w:r>
+        <w:t xml:space="preserve"> (3</w:t>
+      </w:r>
+      <w:r>
+        <w:t xml:space="preserve"> </w:t>
+      </w:r>
+      <w:r>
+        <w:t>Inner Components)</w:t>
+      </w:r>
+    </w:p>
+    <w:p>
+      <w:pPr>
+        <w:pStyle w:val="ListParagraph"/>
+        <w:numPr>
+          <w:ilvl w:val="1"/>
+          <w:numId w:val="2"/>
+        </w:numPr>
+      </w:pPr>
+      <w:r>
+        <w:t>EI Table 1.8.1 — Authority Check</w:t>
+      </w:r>
+    </w:p>
+    <w:p>
+      <w:pPr>
+        <w:pStyle w:val="ListParagraph"/>
+        <w:numPr>
+          <w:ilvl w:val="1"/>
+          <w:numId w:val="2"/>
+        </w:numPr>
+      </w:pPr>
+      <w:r>
+        <w:t>EI Table 1.8.2 — Post Management Check</w:t>
+      </w:r>
+    </w:p>
+    <w:p>
+      <w:pPr>
+        <w:pStyle w:val="ListParagraph"/>
+        <w:numPr>
+          <w:ilvl w:val="1"/>
+          <w:numId w:val="2"/>
+        </w:numPr>
+      </w:pPr>
+      <w:r>
+        <w:t>EI Table 1.8.3 — Validation Check</w:t>
+      </w:r>
+    </w:p>
+    <w:p>
+      <w:pPr>
+        <w:pStyle w:val="ListParagraph"/>
+        <w:numPr>
+          <w:ilvl w:val="0"/>
+          <w:numId w:val="2"/>
+        </w:numPr>
+      </w:pPr>
+      <w:r>
+        <w:t>Entity Identification Tables — Database</w:t>
+      </w:r>
+      <w:r>
+        <w:t xml:space="preserve"> (3 Inner Components)</w:t>
+      </w:r>
+    </w:p>
+    <w:p>
+      <w:pPr>
+        <w:pStyle w:val="ListParagraph"/>
+        <w:numPr>
+          <w:ilvl w:val="1"/>
+          <w:numId w:val="2"/>
+        </w:numPr>
+      </w:pPr>
+      <w:r>
+        <w:t>EI Table 1.13.1 — Query Layer</w:t>
+      </w:r>
+    </w:p>
+    <w:p>
+      <w:pPr>
+        <w:pStyle w:val="ListParagraph"/>
+        <w:numPr>
+          <w:ilvl w:val="1"/>
+          <w:numId w:val="2"/>
+        </w:numPr>
+      </w:pPr>
+      <w:r>
+        <w:t>EI Table 1.13.2 — Data Layer</w:t>
+      </w:r>
+    </w:p>
+    <w:p>
+      <w:pPr>
+        <w:pStyle w:val="ListParagraph"/>
+        <w:numPr>
+          <w:ilvl w:val="1"/>
+          <w:numId w:val="2"/>
+        </w:numPr>
+      </w:pPr>
+      <w:r>
+        <w:t>EI Table 1.13.3 — Indexing Layer</w:t>
+      </w:r>
+    </w:p>
+    <w:p>
+      <w:pPr>
+        <w:pStyle w:val="ListParagraph"/>
+        <w:numPr>
+          <w:ilvl w:val="0"/>
+          <w:numId w:val="2"/>
+        </w:numPr>
+      </w:pPr>
+      <w:r>
+        <w:t>Entity Identification Tables — File / Blob Storage</w:t>
+      </w:r>
+      <w:r>
+        <w:t xml:space="preserve"> (3</w:t>
+      </w:r>
+      <w:r>
+        <w:t xml:space="preserve"> </w:t>
+      </w:r>
+      <w:r>
+        <w:t>Inner Components)</w:t>
+      </w:r>
+    </w:p>
+    <w:p>
+      <w:pPr>
+        <w:pStyle w:val="ListParagraph"/>
+        <w:numPr>
+          <w:ilvl w:val="1"/>
+          <w:numId w:val="2"/>
+        </w:numPr>
+      </w:pPr>
+      <w:r>
+        <w:t>EI Table 1.14.1 — Upload / Validation Layer</w:t>
+      </w:r>
+    </w:p>
+    <w:p>
+      <w:pPr>
+        <w:pStyle w:val="ListParagraph"/>
+        <w:numPr>
+          <w:ilvl w:val="1"/>
+          <w:numId w:val="2"/>
+        </w:numPr>
+      </w:pPr>
+      <w:r>
+        <w:t>EI Table 1.14.2 — Raw Byte Storage</w:t>
+      </w:r>
+    </w:p>
+    <w:p>
+      <w:pPr>
+        <w:pStyle w:val="ListParagraph"/>
+        <w:numPr>
+          <w:ilvl w:val="1"/>
+          <w:numId w:val="2"/>
+        </w:numPr>
+      </w:pPr>
+      <w:r>
+        <w:t>EI Table 1.14.3 — Backup Module</w:t>
+      </w:r>
+    </w:p>
+    <w:p>
+      <w:pPr>
+        <w:pStyle w:val="Alt1-Hd-2"/>
+      </w:pPr>
+      <w:r>
+        <w:lastRenderedPageBreak/>
+        <w:t>Team 2 (</w:t>
+      </w:r>
+      <w:r>
+        <w:t>Savannah Harvey</w:t>
+      </w:r>
+      <w:r>
+        <w:t xml:space="preserve">) - Total </w:t>
+      </w:r>
+      <w:r>
+        <w:t xml:space="preserve">Entity Identification Tables </w:t>
+      </w:r>
+      <w:r>
+        <w:t>Count (1</w:t>
+      </w:r>
+      <w:r>
+        <w:t>3</w:t>
+      </w:r>
+      <w:r>
+        <w:t>)</w:t>
+      </w:r>
+    </w:p>
+    <w:p>
+      <w:pPr>
+        <w:pStyle w:val="ListParagraph"/>
+        <w:numPr>
+          <w:ilvl w:val="0"/>
+          <w:numId w:val="2"/>
+        </w:numPr>
+      </w:pPr>
+      <w:r>
+        <w:t>Entity Identification Tables — API Gateway / Orchestrator (</w:t>
+      </w:r>
+      <w:r>
+        <w:t>1</w:t>
+      </w:r>
+      <w:r>
+        <w:t xml:space="preserve"> Inner Components)</w:t>
+      </w:r>
+    </w:p>
+    <w:p>
+      <w:pPr>
+        <w:pStyle w:val="ListParagraph"/>
+        <w:numPr>
+          <w:ilvl w:val="1"/>
+          <w:numId w:val="2"/>
+        </w:numPr>
+      </w:pPr>
+      <w:r>
+        <w:t>EI Table 1.4.</w:t>
+      </w:r>
+      <w:r>
+        <w:t>8</w:t>
+      </w:r>
+      <w:r>
+        <w:t xml:space="preserve"> — </w:t>
+      </w:r>
+      <w:r>
+        <w:t>Search Orchestrator</w:t>
+      </w:r>
+    </w:p>
+    <w:p>
+      <w:pPr>
+        <w:pStyle w:val="ListParagraph"/>
+        <w:numPr>
+          <w:ilvl w:val="2"/>
+          <w:numId w:val="2"/>
+        </w:numPr>
+      </w:pPr>
+      <w:r>
+        <w:t>domain-specific entities</w:t>
+      </w:r>
+      <w:r>
+        <w:t xml:space="preserve"> in (</w:t>
+      </w:r>
+      <w:r>
+        <w:t>API Gateway / Orchestrator</w:t>
+      </w:r>
+      <w:r>
+        <w:t>)</w:t>
+      </w:r>
+    </w:p>
+    <w:p>
+      <w:pPr>
+        <w:pStyle w:val="ListParagraph"/>
+        <w:numPr>
+          <w:ilvl w:val="0"/>
+          <w:numId w:val="2"/>
+        </w:numPr>
+      </w:pPr>
+      <w:r>
+        <w:t>Entity Identification Tables — Search Service</w:t>
+      </w:r>
+      <w:r>
+        <w:t xml:space="preserve"> (1</w:t>
+      </w:r>
+      <w:r>
+        <w:t>2</w:t>
+      </w:r>
+      <w:r>
+        <w:t xml:space="preserve"> </w:t>
+      </w:r>
+      <w:r>
+        <w:t>Inner Components)</w:t>
+      </w:r>
+    </w:p>
+    <w:p>
+      <w:pPr>
+        <w:pStyle w:val="ListParagraph"/>
+        <w:numPr>
+          <w:ilvl w:val="1"/>
+          <w:numId w:val="2"/>
+        </w:numPr>
+      </w:pPr>
+      <w:r>
+        <w:t>EI Table 1.9.1 — Search Controller</w:t>
+      </w:r>
+    </w:p>
+    <w:p>
+      <w:pPr>
+        <w:pStyle w:val="ListParagraph"/>
+        <w:numPr>
+          <w:ilvl w:val="1"/>
+          <w:numId w:val="2"/>
+        </w:numPr>
+      </w:pPr>
+      <w:r>
+        <w:t>EI Table 1.9.2 — Candidate Search</w:t>
+      </w:r>
+    </w:p>
+    <w:p>
+      <w:pPr>
+        <w:pStyle w:val="ListParagraph"/>
+        <w:numPr>
+          <w:ilvl w:val="1"/>
+          <w:numId w:val="2"/>
+        </w:numPr>
+      </w:pPr>
+      <w:r>
+        <w:t>EI Table 1.9.3 — Job Search</w:t>
+      </w:r>
+    </w:p>
+    <w:p>
+      <w:pPr>
+        <w:pStyle w:val="ListParagraph"/>
+        <w:numPr>
+          <w:ilvl w:val="1"/>
+          <w:numId w:val="2"/>
+        </w:numPr>
+      </w:pPr>
+      <w:r>
+        <w:t>EI Table 1.9.4 — Company Search</w:t>
+      </w:r>
+    </w:p>
+    <w:p>
+      <w:pPr>
+        <w:pStyle w:val="ListParagraph"/>
+        <w:numPr>
+          <w:ilvl w:val="1"/>
+          <w:numId w:val="2"/>
+        </w:numPr>
+      </w:pPr>
+      <w:r>
+        <w:t>EI Table 1.9.5 — Filter Processor</w:t>
+      </w:r>
+    </w:p>
+    <w:p>
+      <w:pPr>
+        <w:pStyle w:val="ListParagraph"/>
+        <w:numPr>
+          <w:ilvl w:val="1"/>
+          <w:numId w:val="2"/>
+        </w:numPr>
+      </w:pPr>
+      <w:r>
+        <w:t>EI Table 1.9.6 — Advanced Search</w:t>
+      </w:r>
+    </w:p>
+    <w:p>
+      <w:pPr>
+        <w:pStyle w:val="ListParagraph"/>
+        <w:numPr>
+          <w:ilvl w:val="1"/>
+          <w:numId w:val="2"/>
+        </w:numPr>
+      </w:pPr>
+      <w:r>
+        <w:t>EI Table 1.9.7 — Wildcard Search</w:t>
+      </w:r>
+    </w:p>
+    <w:p>
+      <w:pPr>
+        <w:pStyle w:val="ListParagraph"/>
+        <w:numPr>
+          <w:ilvl w:val="1"/>
+          <w:numId w:val="2"/>
+        </w:numPr>
+      </w:pPr>
+      <w:r>
+        <w:t>EI Table 1.9.8 — Search Cache</w:t>
+      </w:r>
+    </w:p>
+    <w:p>
+      <w:pPr>
+        <w:pStyle w:val="ListParagraph"/>
+        <w:numPr>
+          <w:ilvl w:val="1"/>
+          <w:numId w:val="2"/>
+        </w:numPr>
+      </w:pPr>
+      <w:r>
+        <w:t>EI Table 1.9.9 — Search Engine Adapter</w:t>
+      </w:r>
+    </w:p>
+    <w:p>
+      <w:pPr>
+        <w:pStyle w:val="ListParagraph"/>
+        <w:numPr>
+          <w:ilvl w:val="1"/>
+          <w:numId w:val="2"/>
+        </w:numPr>
+      </w:pPr>
+      <w:r>
+        <w:t>EI Table 1.9.10 — Search Index / Search Engine</w:t>
+      </w:r>
+    </w:p>
+    <w:p>
+      <w:pPr>
+        <w:pStyle w:val="ListParagraph"/>
+        <w:numPr>
+          <w:ilvl w:val="1"/>
+          <w:numId w:val="2"/>
+        </w:numPr>
+      </w:pPr>
+      <w:r>
+        <w:t>EI Table 1.9.11 — Autocomplete Component</w:t>
+      </w:r>
+    </w:p>
+    <w:p>
+      <w:pPr>
+        <w:pStyle w:val="ListParagraph"/>
+        <w:numPr>
+          <w:ilvl w:val="1"/>
+          <w:numId w:val="2"/>
+        </w:numPr>
+      </w:pPr>
+      <w:r>
+        <w:t>EI Table 1.9.12 — Result Ranking</w:t>
+      </w:r>
+    </w:p>
+    <w:p>
+      <w:pPr>
+        <w:pStyle w:val="Alt1-Hd-2"/>
+      </w:pPr>
+      <w:r>
+        <w:t>Team 3 (</w:t>
+      </w:r>
+      <w:r>
+        <w:t>Spencer Beals</w:t>
+      </w:r>
+      <w:r>
+        <w:t xml:space="preserve">) - Total </w:t>
+      </w:r>
+      <w:r>
+        <w:t xml:space="preserve">Entity Identification Tables </w:t>
+      </w:r>
+      <w:r>
+        <w:t>Count (</w:t>
+      </w:r>
+      <w:r>
+        <w:t>14</w:t>
+      </w:r>
+      <w:r>
+        <w:t>)</w:t>
+      </w:r>
+    </w:p>
+    <w:p>
+      <w:pPr>
+        <w:pStyle w:val="ListParagraph"/>
+        <w:numPr>
+          <w:ilvl w:val="0"/>
+          <w:numId w:val="2"/>
+        </w:numPr>
+      </w:pPr>
+      <w:r>
+        <w:t xml:space="preserve">Entity Identification Tables </w:t>
+      </w:r>
+      <w:r>
+        <w:t xml:space="preserve">— </w:t>
+      </w:r>
+      <w:r>
+        <w:t>API Gateway / Orchestrator</w:t>
+      </w:r>
+      <w:r>
+        <w:t xml:space="preserve"> (</w:t>
+      </w:r>
+      <w:r>
+        <w:t>6</w:t>
+      </w:r>
+      <w:r>
+        <w:t xml:space="preserve"> </w:t>
+      </w:r>
+      <w:r>
+        <w:t>Inner Components)</w:t>
+      </w:r>
+    </w:p>
+    <w:p>
+      <w:pPr>
+        <w:pStyle w:val="ListParagraph"/>
+        <w:numPr>
+          <w:ilvl w:val="1"/>
+          <w:numId w:val="2"/>
+        </w:numPr>
+      </w:pPr>
+      <w:r>
+        <w:t>EI Table 1.4.1 — API Gateway</w:t>
+      </w:r>
+    </w:p>
+    <w:p>
+      <w:pPr>
+        <w:pStyle w:val="ListParagraph"/>
+        <w:numPr>
+          <w:ilvl w:val="1"/>
+          <w:numId w:val="2"/>
+        </w:numPr>
+      </w:pPr>
+      <w:r>
+        <w:t>EI Table 1.4.2 — Authentication Handler</w:t>
+      </w:r>
+    </w:p>
+    <w:p>
+      <w:pPr>
+        <w:pStyle w:val="ListParagraph"/>
+        <w:numPr>
+          <w:ilvl w:val="1"/>
+          <w:numId w:val="2"/>
+        </w:numPr>
+      </w:pPr>
+      <w:r>
+        <w:t xml:space="preserve">EI Table 1.4.3 — </w:t>
+      </w:r>
+      <w:r>
+        <w:t>Request Router</w:t>
+      </w:r>
+    </w:p>
+    <w:p>
+      <w:pPr>
+        <w:pStyle w:val="ListParagraph"/>
+        <w:numPr>
+          <w:ilvl w:val="1"/>
+          <w:numId w:val="2"/>
+        </w:numPr>
+      </w:pPr>
+      <w:r>
+        <w:t xml:space="preserve">EI Table 1.4.4 — </w:t>
+      </w:r>
+      <w:r>
+        <w:t>Request Validator</w:t>
+      </w:r>
+    </w:p>
+    <w:p>
+      <w:pPr>
+        <w:pStyle w:val="ListParagraph"/>
+        <w:numPr>
+          <w:ilvl w:val="1"/>
+          <w:numId w:val="2"/>
+        </w:numPr>
+      </w:pPr>
+      <w:r>
+        <w:t xml:space="preserve">EI </w:t>
+      </w:r>
+      <w:r>
+        <w:t xml:space="preserve">Pattern </w:t>
+      </w:r>
+      <w:r>
+        <w:t xml:space="preserve">Table </w:t>
+      </w:r>
+      <w:r>
+        <w:t>(1.4.5–1.4.12)</w:t>
+      </w:r>
+      <w:r>
+        <w:t xml:space="preserve"> —</w:t>
+      </w:r>
+      <w:r>
+        <w:t xml:space="preserve"> </w:t>
+      </w:r>
+      <w:r>
+        <w:t>Service Orchestrator Pattern</w:t>
+      </w:r>
+    </w:p>
+    <w:p>
+      <w:pPr>
+        <w:pStyle w:val="ListParagraph"/>
+        <w:numPr>
+          <w:ilvl w:val="1"/>
+          <w:numId w:val="2"/>
+        </w:numPr>
+      </w:pPr>
+      <w:r>
+        <w:t>EI Table 1.4.</w:t>
+      </w:r>
+      <w:r>
+        <w:t>9</w:t>
+      </w:r>
+      <w:r>
+        <w:t xml:space="preserve">— </w:t>
+      </w:r>
+      <w:r>
+        <w:t>Communications Orchestrator</w:t>
+      </w:r>
+    </w:p>
+    <w:p>
+      <w:pPr>
+        <w:pStyle w:val="ListParagraph"/>
+        <w:numPr>
+          <w:ilvl w:val="2"/>
+          <w:numId w:val="2"/>
+        </w:numPr>
+      </w:pPr>
+      <w:r>
+        <w:t>domain-specific entities</w:t>
+      </w:r>
+      <w:r>
+        <w:t xml:space="preserve"> in (</w:t>
+      </w:r>
+      <w:r>
+        <w:t>API Gateway / Orchestrator</w:t>
+      </w:r>
+      <w:r>
+        <w:t>)</w:t>
+      </w:r>
+    </w:p>
+    <w:p>
+      <w:pPr>
+        <w:pStyle w:val="ListParagraph"/>
+        <w:numPr>
+          <w:ilvl w:val="0"/>
+          <w:numId w:val="2"/>
+        </w:numPr>
+      </w:pPr>
+      <w:r>
+        <w:t>Entity Identification Tables — Communication Services</w:t>
+      </w:r>
+      <w:r>
+        <w:t xml:space="preserve"> </w:t>
+      </w:r>
+      <w:r>
+        <w:t xml:space="preserve">(Notifications + News Feed) </w:t>
+      </w:r>
+      <w:r>
+        <w:t>(</w:t>
+      </w:r>
+      <w:r>
+        <w:t>8</w:t>
+      </w:r>
+      <w:r>
+        <w:t xml:space="preserve"> </w:t>
+      </w:r>
+      <w:r>
+        <w:t>Inner Components)</w:t>
+      </w:r>
+    </w:p>
+    <w:p>
+      <w:pPr>
+        <w:pStyle w:val="ListParagraph"/>
+        <w:numPr>
+          <w:ilvl w:val="1"/>
+          <w:numId w:val="2"/>
+        </w:numPr>
+      </w:pPr>
+      <w:r>
+        <w:t>EI Table 1.10.1 — Event Listener</w:t>
+      </w:r>
+    </w:p>
+    <w:p>
+      <w:pPr>
+        <w:pStyle w:val="ListParagraph"/>
+        <w:numPr>
+          <w:ilvl w:val="1"/>
+          <w:numId w:val="2"/>
+        </w:numPr>
+      </w:pPr>
+      <w:r>
+        <w:t>EI Table 1.10.2 — Notification Controller</w:t>
+      </w:r>
+    </w:p>
+    <w:p>
+      <w:pPr>
+        <w:pStyle w:val="ListParagraph"/>
+        <w:numPr>
+          <w:ilvl w:val="1"/>
+          <w:numId w:val="2"/>
+        </w:numPr>
+      </w:pPr>
+      <w:r>
+        <w:t>EI Table 1.10.3 — Notification Orchestrator</w:t>
+      </w:r>
+    </w:p>
+    <w:p>
+      <w:pPr>
+        <w:pStyle w:val="ListParagraph"/>
+        <w:numPr>
+          <w:ilvl w:val="1"/>
+          <w:numId w:val="2"/>
+        </w:numPr>
+      </w:pPr>
+      <w:r>
+        <w:t>EI Table 1.10.4 — Notification Formatter</w:t>
+      </w:r>
+    </w:p>
+    <w:p>
+      <w:pPr>
+        <w:pStyle w:val="ListParagraph"/>
+        <w:numPr>
+          <w:ilvl w:val="1"/>
+          <w:numId w:val="2"/>
+        </w:numPr>
+      </w:pPr>
+      <w:r>
+        <w:t>EI Table 1.10.5 — Notification Repository</w:t>
+      </w:r>
+    </w:p>
+    <w:p>
+      <w:pPr>
+        <w:pStyle w:val="ListParagraph"/>
+        <w:numPr>
+          <w:ilvl w:val="1"/>
+          <w:numId w:val="2"/>
+        </w:numPr>
+      </w:pPr>
+      <w:r>
+        <w:t>EI Table 1.10.6 — Recipient Resolver</w:t>
+      </w:r>
+    </w:p>
+    <w:p>
+      <w:pPr>
+        <w:pStyle w:val="ListParagraph"/>
+        <w:numPr>
+          <w:ilvl w:val="1"/>
+          <w:numId w:val="2"/>
+        </w:numPr>
+      </w:pPr>
+      <w:r>
+        <w:t>EI Table 1.10.7 — Push Delivery Component</w:t>
+      </w:r>
+    </w:p>
+    <w:p>
+      <w:pPr>
+        <w:pStyle w:val="ListParagraph"/>
+        <w:numPr>
+          <w:ilvl w:val="1"/>
+          <w:numId w:val="2"/>
+        </w:numPr>
+      </w:pPr>
+      <w:r>
+        <w:t>EI Table 1.10.8 — News Feed Manager</w:t>
+      </w:r>
+    </w:p>
+    <w:p>
+      <w:pPr>
+        <w:pStyle w:val="Alt1-Hd-2"/>
+      </w:pPr>
+      <w:r>
+        <w:lastRenderedPageBreak/>
+        <w:t>Team 4 (</w:t>
+      </w:r>
+      <w:r>
+        <w:t>Kimberly Uresti</w:t>
+      </w:r>
+      <w:r>
+        <w:t xml:space="preserve">) - Total </w:t>
+      </w:r>
+      <w:r>
+        <w:t xml:space="preserve">Entity Identification Tables </w:t>
+      </w:r>
+      <w:r>
+        <w:t>Count (</w:t>
+      </w:r>
+      <w:r>
+        <w:t>10</w:t>
+      </w:r>
+      <w:r>
+        <w:t>)</w:t>
+      </w:r>
+    </w:p>
+    <w:p>
+      <w:pPr>
+        <w:pStyle w:val="ListParagraph"/>
+        <w:numPr>
+          <w:ilvl w:val="0"/>
+          <w:numId w:val="2"/>
+        </w:numPr>
+      </w:pPr>
+      <w:r>
+        <w:t>Entity Identification Tables — API Gateway / Orchestrator (</w:t>
+      </w:r>
+      <w:r>
+        <w:t>1</w:t>
+      </w:r>
+      <w:r>
+        <w:t xml:space="preserve"> Inner Components)</w:t>
+      </w:r>
+    </w:p>
+    <w:p>
+      <w:pPr>
+        <w:pStyle w:val="ListParagraph"/>
+        <w:numPr>
+          <w:ilvl w:val="1"/>
+          <w:numId w:val="2"/>
+        </w:numPr>
+      </w:pPr>
+      <w:r>
+        <w:t>EI Table 1.4.</w:t>
+      </w:r>
+      <w:r>
+        <w:t>5</w:t>
+      </w:r>
+      <w:r>
+        <w:t xml:space="preserve"> — </w:t>
+      </w:r>
+      <w:r>
+        <w:t>Profile Orchestrator</w:t>
+      </w:r>
+    </w:p>
+    <w:p>
+      <w:pPr>
+        <w:pStyle w:val="ListParagraph"/>
+        <w:numPr>
+          <w:ilvl w:val="2"/>
+          <w:numId w:val="2"/>
+        </w:numPr>
+      </w:pPr>
+      <w:r>
+        <w:t>domain-specific entities in (</w:t>
+      </w:r>
+      <w:r>
+        <w:t>API Gateway / Orchestrator</w:t>
+      </w:r>
+      <w:r>
+        <w:t>)</w:t>
+      </w:r>
+    </w:p>
+    <w:p>
+      <w:pPr>
+        <w:pStyle w:val="ListParagraph"/>
+        <w:numPr>
+          <w:ilvl w:val="0"/>
+          <w:numId w:val="2"/>
+        </w:numPr>
+      </w:pPr>
+      <w:r>
+        <w:t>Entity Identification Tables — Authentication Service</w:t>
+      </w:r>
+      <w:r>
+        <w:t xml:space="preserve"> (4</w:t>
+      </w:r>
+      <w:r>
+        <w:t xml:space="preserve"> </w:t>
+      </w:r>
+      <w:r>
+        <w:t>Inner Components)</w:t>
+      </w:r>
+    </w:p>
+    <w:p>
+      <w:pPr>
+        <w:pStyle w:val="ListParagraph"/>
+        <w:numPr>
+          <w:ilvl w:val="1"/>
+          <w:numId w:val="2"/>
+        </w:numPr>
+      </w:pPr>
+      <w:r>
+        <w:t>EI Table 1.5.1 — Registration Manager</w:t>
+      </w:r>
+    </w:p>
+    <w:p>
+      <w:pPr>
+        <w:pStyle w:val="ListParagraph"/>
+        <w:numPr>
+          <w:ilvl w:val="1"/>
+          <w:numId w:val="2"/>
+        </w:numPr>
+      </w:pPr>
+      <w:r>
+        <w:t>EI Table 1.5.2 — Authorization / Role Manager</w:t>
+      </w:r>
+    </w:p>
+    <w:p>
+      <w:pPr>
+        <w:pStyle w:val="ListParagraph"/>
+        <w:numPr>
+          <w:ilvl w:val="1"/>
+          <w:numId w:val="2"/>
+        </w:numPr>
+      </w:pPr>
+      <w:r>
+        <w:t>EI Table 1.5.3 — Login &amp; Session Manager</w:t>
+      </w:r>
+    </w:p>
+    <w:p>
+      <w:pPr>
+        <w:pStyle w:val="ListParagraph"/>
+        <w:numPr>
+          <w:ilvl w:val="1"/>
+          <w:numId w:val="2"/>
+        </w:numPr>
+      </w:pPr>
+      <w:r>
+        <w:t>EI Table 1.5.4 — Security Audit Logger</w:t>
+      </w:r>
+    </w:p>
+    <w:p>
+      <w:pPr>
+        <w:pStyle w:val="ListParagraph"/>
+        <w:numPr>
+          <w:ilvl w:val="0"/>
+          <w:numId w:val="2"/>
+        </w:numPr>
+      </w:pPr>
+      <w:r>
+        <w:t xml:space="preserve">Entity Identification Tables — Profile Management </w:t>
+      </w:r>
+      <w:r>
+        <w:t>(</w:t>
+      </w:r>
+      <w:r>
+        <w:t>5</w:t>
+      </w:r>
+      <w:r>
+        <w:t xml:space="preserve"> </w:t>
+      </w:r>
+      <w:r>
+        <w:t>Inner Components)</w:t>
+      </w:r>
+    </w:p>
+    <w:p>
+      <w:pPr>
+        <w:pStyle w:val="ListParagraph"/>
+        <w:numPr>
+          <w:ilvl w:val="1"/>
+          <w:numId w:val="2"/>
+        </w:numPr>
+      </w:pPr>
+      <w:r>
+        <w:t>EI Table 1.6.1 — Profile Manager</w:t>
+      </w:r>
+    </w:p>
+    <w:p>
+      <w:pPr>
+        <w:pStyle w:val="ListParagraph"/>
+        <w:numPr>
+          <w:ilvl w:val="1"/>
+          <w:numId w:val="2"/>
+        </w:numPr>
+      </w:pPr>
+      <w:r>
+        <w:t>EI Table 1.6.2 — Image Manager</w:t>
+      </w:r>
+    </w:p>
+    <w:p>
+      <w:pPr>
+        <w:pStyle w:val="ListParagraph"/>
+        <w:numPr>
+          <w:ilvl w:val="1"/>
+          <w:numId w:val="2"/>
+        </w:numPr>
+      </w:pPr>
+      <w:r>
+        <w:t>EI Table 1.6.3 — Preferences Manager</w:t>
+      </w:r>
+    </w:p>
+    <w:p>
+      <w:pPr>
+        <w:pStyle w:val="ListParagraph"/>
+        <w:numPr>
+          <w:ilvl w:val="1"/>
+          <w:numId w:val="2"/>
+        </w:numPr>
+      </w:pPr>
+      <w:r>
+        <w:t>EI Table 1.6.4 — Privacy Settings Manager</w:t>
+      </w:r>
+    </w:p>
+    <w:p>
+      <w:pPr>
+        <w:pStyle w:val="ListParagraph"/>
+        <w:numPr>
+          <w:ilvl w:val="1"/>
+          <w:numId w:val="2"/>
+        </w:numPr>
+      </w:pPr>
+      <w:r>
+        <w:t>EI Table 1.6.5 — Profile Audit Logger</w:t>
+      </w:r>
+    </w:p>
+    <w:p>
+      <w:pPr>
+        <w:pStyle w:val="Alt1-Hd-2"/>
+      </w:pPr>
+      <w:r>
+        <w:t>Team 5 (</w:t>
+      </w:r>
+      <w:r>
+        <w:t>Adam Sheridan</w:t>
+      </w:r>
+      <w:r>
+        <w:t xml:space="preserve">) - Total </w:t>
+      </w:r>
+      <w:r>
+        <w:t xml:space="preserve">Entity Identification Tables </w:t>
+      </w:r>
+      <w:r>
+        <w:t>Count (</w:t>
+      </w:r>
+      <w:r>
+        <w:t>10</w:t>
+      </w:r>
+      <w:r>
+        <w:t>)</w:t>
+      </w:r>
+    </w:p>
+    <w:p>
+      <w:pPr>
+        <w:pStyle w:val="ListParagraph"/>
+        <w:numPr>
+          <w:ilvl w:val="0"/>
+          <w:numId w:val="2"/>
+        </w:numPr>
+      </w:pPr>
+      <w:r>
+        <w:t>Entity Identification Tables — API Gateway / Orchestrator (</w:t>
+      </w:r>
+      <w:r>
+        <w:t>2</w:t>
+      </w:r>
+      <w:r>
+        <w:t xml:space="preserve"> Inner Components)</w:t>
+      </w:r>
+    </w:p>
+    <w:p>
+      <w:pPr>
+        <w:pStyle w:val="ListParagraph"/>
+        <w:numPr>
+          <w:ilvl w:val="1"/>
+          <w:numId w:val="2"/>
+        </w:numPr>
+      </w:pPr>
+      <w:r>
         <w:t>EI Table 1.4.1</w:t>
       </w:r>
       <w:r>
+        <w:t>1</w:t>
+      </w:r>
+      <w:r>
+        <w:t xml:space="preserve"> — </w:t>
+      </w:r>
+      <w:r>
+        <w:t>External Services Orchestrator</w:t>
+      </w:r>
+    </w:p>
+    <w:p>
+      <w:pPr>
+        <w:pStyle w:val="ListParagraph"/>
+        <w:numPr>
+          <w:ilvl w:val="2"/>
+          <w:numId w:val="2"/>
+        </w:numPr>
+      </w:pPr>
+      <w:r>
+        <w:t>domain-specific entities in (API Gateway / Orchestrator)</w:t>
+      </w:r>
+    </w:p>
+    <w:p>
+      <w:pPr>
+        <w:pStyle w:val="ListParagraph"/>
+        <w:numPr>
+          <w:ilvl w:val="1"/>
+          <w:numId w:val="2"/>
+        </w:numPr>
+      </w:pPr>
+      <w:r>
+        <w:t>EI Table 1.4.1</w:t>
+      </w:r>
+      <w:r>
         <w:t>2</w:t>
       </w:r>
       <w:r>
-        <w:t xml:space="preserve"> — External Services Orchestrator</w:t>
-      </w:r>
-      <w:r>
-        <w:t>,"</w:t>
-      </w:r>
-      <w:r>
-        <w:t xml:space="preserve"> and "</w:t>
-      </w:r>
-      <w:r>
-        <w:t>EI Table 1.4.13 — Analytics Orchestrator</w:t>
-      </w:r>
-      <w:r>
-        <w:t>"</w:t>
-      </w:r>
-      <w:r>
-        <w:t xml:space="preserve">). </w:t>
-      </w:r>
-      <w:r>
-        <w:t>Each team is to place t</w:t>
-      </w:r>
-      <w:r>
-        <w:t xml:space="preserve">hese domain-specific EITs under the </w:t>
-      </w:r>
-      <w:r>
-        <w:t>heading of "</w:t>
-      </w:r>
-      <w:r>
-        <w:t>Entity Identification Tables — API Gateway / Orchestrator</w:t>
-      </w:r>
-      <w:r>
-        <w:t>".</w:t>
+        <w:t xml:space="preserve"> — </w:t>
+      </w:r>
+      <w:r>
+        <w:t>Analytics Orchestrator</w:t>
+      </w:r>
+    </w:p>
+    <w:p>
+      <w:pPr>
+        <w:pStyle w:val="ListParagraph"/>
+        <w:numPr>
+          <w:ilvl w:val="2"/>
+          <w:numId w:val="2"/>
+        </w:numPr>
+      </w:pPr>
+      <w:r>
+        <w:t>domain-specific entities in (API Gateway / Orchestrator)</w:t>
+      </w:r>
+    </w:p>
+    <w:p>
+      <w:pPr>
+        <w:pStyle w:val="ListParagraph"/>
+        <w:numPr>
+          <w:ilvl w:val="0"/>
+          <w:numId w:val="2"/>
+        </w:numPr>
+      </w:pPr>
+      <w:r>
+        <w:t>Entity Identification Tables — External Services</w:t>
+      </w:r>
+      <w:r>
+        <w:t xml:space="preserve"> </w:t>
+      </w:r>
+      <w:r>
+        <w:t>(</w:t>
+      </w:r>
+      <w:r>
+        <w:t>3</w:t>
+      </w:r>
+      <w:r>
+        <w:t xml:space="preserve"> </w:t>
+      </w:r>
+      <w:r>
+        <w:t>Inner Components)</w:t>
+      </w:r>
+    </w:p>
+    <w:p>
+      <w:pPr>
+        <w:pStyle w:val="ListParagraph"/>
+        <w:numPr>
+          <w:ilvl w:val="1"/>
+          <w:numId w:val="2"/>
+        </w:numPr>
+      </w:pPr>
+      <w:r>
+        <w:t>EI Table 1.11.1 — USPS Address Validation Adapter</w:t>
+      </w:r>
+    </w:p>
+    <w:p>
+      <w:pPr>
+        <w:pStyle w:val="ListParagraph"/>
+        <w:numPr>
+          <w:ilvl w:val="1"/>
+          <w:numId w:val="2"/>
+        </w:numPr>
+      </w:pPr>
+      <w:r>
+        <w:t>EI Table 1.11.2 — Autocomplete API Adapter</w:t>
+      </w:r>
+    </w:p>
+    <w:p>
+      <w:pPr>
+        <w:pStyle w:val="ListParagraph"/>
+        <w:numPr>
+          <w:ilvl w:val="1"/>
+          <w:numId w:val="2"/>
+        </w:numPr>
+      </w:pPr>
+      <w:r>
+        <w:t>EI Table 1.11.3 — Push Notification Gateway</w:t>
+      </w:r>
+    </w:p>
+    <w:p>
+      <w:pPr>
+        <w:pStyle w:val="ListParagraph"/>
+        <w:numPr>
+          <w:ilvl w:val="0"/>
+          <w:numId w:val="2"/>
+        </w:numPr>
+      </w:pPr>
+      <w:r>
+        <w:t>Entity Identification Tables — Analytics Service</w:t>
+      </w:r>
+      <w:r>
+        <w:t xml:space="preserve"> </w:t>
+      </w:r>
+      <w:r>
+        <w:t>(</w:t>
+      </w:r>
+      <w:r>
+        <w:t>5</w:t>
+      </w:r>
+      <w:r>
+        <w:t xml:space="preserve"> </w:t>
+      </w:r>
+      <w:r>
+        <w:t>Inner Components)</w:t>
+      </w:r>
+    </w:p>
+    <w:p>
+      <w:pPr>
+        <w:pStyle w:val="ListParagraph"/>
+        <w:numPr>
+          <w:ilvl w:val="1"/>
+          <w:numId w:val="2"/>
+        </w:numPr>
+      </w:pPr>
+      <w:r>
+        <w:t>EI Table 1.12.1 — Job Posting Analytics</w:t>
+      </w:r>
+    </w:p>
+    <w:p>
+      <w:pPr>
+        <w:pStyle w:val="ListParagraph"/>
+        <w:numPr>
+          <w:ilvl w:val="1"/>
+          <w:numId w:val="2"/>
+        </w:numPr>
+      </w:pPr>
+      <w:r>
+        <w:t>EI Table 1.12.2 — Search and Candidate Analytics</w:t>
+      </w:r>
+    </w:p>
+    <w:p>
+      <w:pPr>
+        <w:pStyle w:val="ListParagraph"/>
+        <w:numPr>
+          <w:ilvl w:val="1"/>
+          <w:numId w:val="2"/>
+        </w:numPr>
+      </w:pPr>
+      <w:r>
+        <w:t>EI Table 1.12.3 — Profile and Resume Engagement</w:t>
+      </w:r>
+    </w:p>
+    <w:p>
+      <w:pPr>
+        <w:pStyle w:val="ListParagraph"/>
+        <w:numPr>
+          <w:ilvl w:val="1"/>
+          <w:numId w:val="2"/>
+        </w:numPr>
+      </w:pPr>
+      <w:r>
+        <w:t>EI Table 1.12.4 — Notification and News Feed Analytics</w:t>
+      </w:r>
+    </w:p>
+    <w:p>
+      <w:pPr>
+        <w:pStyle w:val="ListParagraph"/>
+        <w:numPr>
+          <w:ilvl w:val="1"/>
+          <w:numId w:val="2"/>
+        </w:numPr>
+      </w:pPr>
+      <w:r>
+        <w:t>EI Table 1.12.5 — Performance Monitor</w:t>
       </w:r>
     </w:p>
     <w:p>
@@ -2276,25 +3416,22 @@
         <w:pStyle w:val="Alt1-Hd-2"/>
       </w:pPr>
       <w:r>
-        <w:t>Team 1</w:t>
-      </w:r>
-      <w:r>
-        <w:t xml:space="preserve"> </w:t>
-      </w:r>
-      <w:r>
-        <w:t>(Danny Capps)</w:t>
-      </w:r>
-      <w:r>
-        <w:t xml:space="preserve"> - Total </w:t>
+        <w:t>Team 6 (</w:t>
+      </w:r>
+      <w:r>
+        <w:t>Marco Quintero</w:t>
+      </w:r>
+      <w:r>
+        <w:t xml:space="preserve">) - Total </w:t>
       </w:r>
       <w:r>
         <w:t xml:space="preserve">Entity Identification Tables </w:t>
       </w:r>
       <w:r>
-        <w:t>Count (</w:t>
-      </w:r>
-      <w:r>
-        <w:t>13</w:t>
+        <w:t>Count (1</w:t>
+      </w:r>
+      <w:r>
+        <w:t>3</w:t>
       </w:r>
       <w:r>
         <w:t>)</w:t>
@@ -2312,7 +3449,7 @@
         <w:t>Entity Identification Tables — API Gateway / Orchestrator (</w:t>
       </w:r>
       <w:r>
-        <w:t>1</w:t>
+        <w:t>2</w:t>
       </w:r>
       <w:r>
         <w:t xml:space="preserve"> Inner Components)</w:t>
@@ -2327,10 +3464,16 @@
         </w:numPr>
       </w:pPr>
       <w:r>
-        <w:t xml:space="preserve">EI Table 1.4.8 — </w:t>
-      </w:r>
-      <w:r>
-        <w:t>Job Orchestrator</w:t>
+        <w:t>EI Table 1.4.</w:t>
+      </w:r>
+      <w:r>
+        <w:t>6</w:t>
+      </w:r>
+      <w:r>
+        <w:t xml:space="preserve"> — </w:t>
+      </w:r>
+      <w:r>
+        <w:t>Resume Orchestrator</w:t>
       </w:r>
     </w:p>
     <w:p>
@@ -2358,1405 +3501,18 @@
       <w:pPr>
         <w:pStyle w:val="ListParagraph"/>
         <w:numPr>
-          <w:ilvl w:val="0"/>
-          <w:numId w:val="2"/>
-        </w:numPr>
-      </w:pPr>
-      <w:r>
-        <w:t>Entity Identification Tables — Job Posting Service</w:t>
-      </w:r>
-      <w:r>
-        <w:t xml:space="preserve"> (3</w:t>
-      </w:r>
-      <w:r>
-        <w:t xml:space="preserve"> </w:t>
-      </w:r>
-      <w:r>
-        <w:t>Inner Components)</w:t>
-      </w:r>
-    </w:p>
-    <w:p>
-      <w:pPr>
-        <w:pStyle w:val="ListParagraph"/>
-        <w:numPr>
-          <w:ilvl w:val="1"/>
-          <w:numId w:val="2"/>
-        </w:numPr>
-        <w:cnfStyle w:val="000000100000" w:firstRow="0" w:lastRow="0" w:firstColumn="0" w:lastColumn="0" w:oddVBand="0" w:evenVBand="0" w:oddHBand="1" w:evenHBand="0" w:firstRowFirstColumn="0" w:firstRowLastColumn="0" w:lastRowFirstColumn="0" w:lastRowLastColumn="0"/>
-      </w:pPr>
-      <w:r>
-        <w:t>EI Table 1.8.1 — Authority Check</w:t>
-      </w:r>
-    </w:p>
-    <w:p>
-      <w:pPr>
-        <w:pStyle w:val="ListParagraph"/>
-        <w:numPr>
-          <w:ilvl w:val="1"/>
-          <w:numId w:val="2"/>
-        </w:numPr>
-        <w:cnfStyle w:val="000000100000" w:firstRow="0" w:lastRow="0" w:firstColumn="0" w:lastColumn="0" w:oddVBand="0" w:evenVBand="0" w:oddHBand="1" w:evenHBand="0" w:firstRowFirstColumn="0" w:firstRowLastColumn="0" w:lastRowFirstColumn="0" w:lastRowLastColumn="0"/>
-      </w:pPr>
-      <w:r>
-        <w:t>EI Table 1.8.2 — Post Management Check</w:t>
-      </w:r>
-    </w:p>
-    <w:p>
-      <w:pPr>
-        <w:pStyle w:val="ListParagraph"/>
-        <w:numPr>
-          <w:ilvl w:val="1"/>
-          <w:numId w:val="2"/>
-        </w:numPr>
-        <w:cnfStyle w:val="000000100000" w:firstRow="0" w:lastRow="0" w:firstColumn="0" w:lastColumn="0" w:oddVBand="0" w:evenVBand="0" w:oddHBand="1" w:evenHBand="0" w:firstRowFirstColumn="0" w:firstRowLastColumn="0" w:lastRowFirstColumn="0" w:lastRowLastColumn="0"/>
-      </w:pPr>
-      <w:r>
-        <w:t>EI Table 1.8.3 — Validation Check</w:t>
-      </w:r>
-    </w:p>
-    <w:p>
-      <w:pPr>
-        <w:pStyle w:val="ListParagraph"/>
-        <w:numPr>
-          <w:ilvl w:val="0"/>
-          <w:numId w:val="2"/>
-        </w:numPr>
-        <w:cnfStyle w:val="000000100000" w:firstRow="0" w:lastRow="0" w:firstColumn="0" w:lastColumn="0" w:oddVBand="0" w:evenVBand="0" w:oddHBand="1" w:evenHBand="0" w:firstRowFirstColumn="0" w:firstRowLastColumn="0" w:lastRowFirstColumn="0" w:lastRowLastColumn="0"/>
-      </w:pPr>
-      <w:r>
-        <w:t>Entity Identification Tables — Database</w:t>
-      </w:r>
-      <w:r>
-        <w:t xml:space="preserve"> (3 Inner Components)</w:t>
-      </w:r>
-    </w:p>
-    <w:p>
-      <w:pPr>
-        <w:pStyle w:val="ListParagraph"/>
-        <w:numPr>
-          <w:ilvl w:val="1"/>
-          <w:numId w:val="2"/>
-        </w:numPr>
-        <w:cnfStyle w:val="000000100000" w:firstRow="0" w:lastRow="0" w:firstColumn="0" w:lastColumn="0" w:oddVBand="0" w:evenVBand="0" w:oddHBand="1" w:evenHBand="0" w:firstRowFirstColumn="0" w:firstRowLastColumn="0" w:lastRowFirstColumn="0" w:lastRowLastColumn="0"/>
-      </w:pPr>
-      <w:r>
-        <w:t>EI Table 1.13.1 — Query Layer</w:t>
-      </w:r>
-    </w:p>
-    <w:p>
-      <w:pPr>
-        <w:pStyle w:val="ListParagraph"/>
-        <w:numPr>
-          <w:ilvl w:val="1"/>
-          <w:numId w:val="2"/>
-        </w:numPr>
-        <w:cnfStyle w:val="000000100000" w:firstRow="0" w:lastRow="0" w:firstColumn="0" w:lastColumn="0" w:oddVBand="0" w:evenVBand="0" w:oddHBand="1" w:evenHBand="0" w:firstRowFirstColumn="0" w:firstRowLastColumn="0" w:lastRowFirstColumn="0" w:lastRowLastColumn="0"/>
-      </w:pPr>
-      <w:r>
-        <w:t>EI Table 1.13.2 — Data Layer</w:t>
-      </w:r>
-    </w:p>
-    <w:p>
-      <w:pPr>
-        <w:pStyle w:val="ListParagraph"/>
-        <w:numPr>
-          <w:ilvl w:val="1"/>
-          <w:numId w:val="2"/>
-        </w:numPr>
-        <w:cnfStyle w:val="000000100000" w:firstRow="0" w:lastRow="0" w:firstColumn="0" w:lastColumn="0" w:oddVBand="0" w:evenVBand="0" w:oddHBand="1" w:evenHBand="0" w:firstRowFirstColumn="0" w:firstRowLastColumn="0" w:lastRowFirstColumn="0" w:lastRowLastColumn="0"/>
-      </w:pPr>
-      <w:r>
-        <w:t>EI Table 1.13.3 — Indexing Layer</w:t>
-      </w:r>
-    </w:p>
-    <w:p>
-      <w:pPr>
-        <w:pStyle w:val="ListParagraph"/>
-        <w:numPr>
-          <w:ilvl w:val="0"/>
-          <w:numId w:val="2"/>
-        </w:numPr>
-        <w:cnfStyle w:val="000000100000" w:firstRow="0" w:lastRow="0" w:firstColumn="0" w:lastColumn="0" w:oddVBand="0" w:evenVBand="0" w:oddHBand="1" w:evenHBand="0" w:firstRowFirstColumn="0" w:firstRowLastColumn="0" w:lastRowFirstColumn="0" w:lastRowLastColumn="0"/>
-      </w:pPr>
-      <w:r>
-        <w:t>Entity Identification Tables — File / Blob Storage</w:t>
-      </w:r>
-      <w:r>
-        <w:t xml:space="preserve"> (3</w:t>
-      </w:r>
-      <w:r>
-        <w:t xml:space="preserve"> </w:t>
-      </w:r>
-      <w:r>
-        <w:t>Inner Components</w:t>
-      </w:r>
-      <w:r>
-        <w:t>)</w:t>
-      </w:r>
-    </w:p>
-    <w:p>
-      <w:pPr>
-        <w:pStyle w:val="ListParagraph"/>
-        <w:numPr>
-          <w:ilvl w:val="1"/>
-          <w:numId w:val="2"/>
-        </w:numPr>
-        <w:cnfStyle w:val="000000100000" w:firstRow="0" w:lastRow="0" w:firstColumn="0" w:lastColumn="0" w:oddVBand="0" w:evenVBand="0" w:oddHBand="1" w:evenHBand="0" w:firstRowFirstColumn="0" w:firstRowLastColumn="0" w:lastRowFirstColumn="0" w:lastRowLastColumn="0"/>
-      </w:pPr>
-      <w:r>
-        <w:t>EI Table 1.14.1 — Upload / Validation Layer</w:t>
-      </w:r>
-    </w:p>
-    <w:p>
-      <w:pPr>
-        <w:pStyle w:val="ListParagraph"/>
-        <w:numPr>
-          <w:ilvl w:val="1"/>
-          <w:numId w:val="2"/>
-        </w:numPr>
-        <w:cnfStyle w:val="000000100000" w:firstRow="0" w:lastRow="0" w:firstColumn="0" w:lastColumn="0" w:oddVBand="0" w:evenVBand="0" w:oddHBand="1" w:evenHBand="0" w:firstRowFirstColumn="0" w:firstRowLastColumn="0" w:lastRowFirstColumn="0" w:lastRowLastColumn="0"/>
-      </w:pPr>
-      <w:r>
-        <w:t>EI Table 1.14.2 — Raw Byte Storage</w:t>
-      </w:r>
-    </w:p>
-    <w:p>
-      <w:pPr>
-        <w:pStyle w:val="ListParagraph"/>
-        <w:numPr>
-          <w:ilvl w:val="1"/>
-          <w:numId w:val="2"/>
-        </w:numPr>
-        <w:cnfStyle w:val="000000100000" w:firstRow="0" w:lastRow="0" w:firstColumn="0" w:lastColumn="0" w:oddVBand="0" w:evenVBand="0" w:oddHBand="1" w:evenHBand="0" w:firstRowFirstColumn="0" w:firstRowLastColumn="0" w:lastRowFirstColumn="0" w:lastRowLastColumn="0"/>
-      </w:pPr>
-      <w:r>
-        <w:t>EI Table 1.14.3 — Backup Module</w:t>
-      </w:r>
-    </w:p>
-    <w:p>
-      <w:pPr>
-        <w:pStyle w:val="Alt1-Hd-2"/>
-      </w:pPr>
-      <w:r>
-        <w:lastRenderedPageBreak/>
-        <w:t xml:space="preserve">Team </w:t>
-      </w:r>
-      <w:r>
-        <w:t>2</w:t>
-      </w:r>
-      <w:r>
-        <w:t xml:space="preserve"> (</w:t>
-      </w:r>
-      <w:r>
-        <w:t>Savannah Harvey</w:t>
-      </w:r>
-      <w:r>
-        <w:t xml:space="preserve">) - Total </w:t>
-      </w:r>
-      <w:r>
-        <w:t xml:space="preserve">Entity Identification Tables </w:t>
-      </w:r>
-      <w:r>
-        <w:t>Count (</w:t>
-      </w:r>
-      <w:r>
-        <w:t>1</w:t>
-      </w:r>
-      <w:r>
-        <w:t>3</w:t>
-      </w:r>
-      <w:r>
-        <w:t>)</w:t>
-      </w:r>
-    </w:p>
-    <w:p>
-      <w:pPr>
-        <w:pStyle w:val="ListParagraph"/>
-        <w:numPr>
-          <w:ilvl w:val="0"/>
-          <w:numId w:val="2"/>
-        </w:numPr>
-      </w:pPr>
-      <w:r>
-        <w:t>Entity Identification Tables — API Gateway / Orchestrator (</w:t>
-      </w:r>
-      <w:r>
-        <w:t>1</w:t>
-      </w:r>
-      <w:r>
-        <w:t xml:space="preserve"> Inner Components)</w:t>
-      </w:r>
-    </w:p>
-    <w:p>
-      <w:pPr>
-        <w:pStyle w:val="ListParagraph"/>
-        <w:numPr>
-          <w:ilvl w:val="1"/>
-          <w:numId w:val="2"/>
-        </w:numPr>
-      </w:pPr>
-      <w:r>
-        <w:t xml:space="preserve">EI Table 1.4.9 — </w:t>
-      </w:r>
-      <w:r>
-        <w:t>Search Orchestrator</w:t>
-      </w:r>
-    </w:p>
-    <w:p>
-      <w:pPr>
-        <w:pStyle w:val="ListParagraph"/>
-        <w:numPr>
-          <w:ilvl w:val="2"/>
-          <w:numId w:val="2"/>
-        </w:numPr>
-      </w:pPr>
-      <w:r>
-        <w:t>domain-specific entities</w:t>
-      </w:r>
-      <w:r>
-        <w:t xml:space="preserve"> in (</w:t>
-      </w:r>
-      <w:r>
-        <w:t>API Gateway / Orchestrator</w:t>
-      </w:r>
-      <w:r>
-        <w:t>)</w:t>
-      </w:r>
-    </w:p>
-    <w:p>
-      <w:pPr>
-        <w:pStyle w:val="ListParagraph"/>
-        <w:numPr>
-          <w:ilvl w:val="0"/>
-          <w:numId w:val="2"/>
-        </w:numPr>
-      </w:pPr>
-      <w:r>
-        <w:t>Entity Identification Tables — Search Service</w:t>
-      </w:r>
-      <w:r>
-        <w:t xml:space="preserve"> (</w:t>
-      </w:r>
-      <w:r>
-        <w:t>1</w:t>
-      </w:r>
-      <w:r>
-        <w:t>2</w:t>
-      </w:r>
-      <w:r>
-        <w:t xml:space="preserve"> </w:t>
-      </w:r>
-      <w:r>
-        <w:t>Inner Components)</w:t>
-      </w:r>
-    </w:p>
-    <w:p>
-      <w:pPr>
-        <w:pStyle w:val="ListParagraph"/>
-        <w:numPr>
-          <w:ilvl w:val="1"/>
-          <w:numId w:val="2"/>
-        </w:numPr>
-        <w:cnfStyle w:val="000000100000" w:firstRow="0" w:lastRow="0" w:firstColumn="0" w:lastColumn="0" w:oddVBand="0" w:evenVBand="0" w:oddHBand="1" w:evenHBand="0" w:firstRowFirstColumn="0" w:firstRowLastColumn="0" w:lastRowFirstColumn="0" w:lastRowLastColumn="0"/>
-      </w:pPr>
-      <w:r>
-        <w:t>EI Table 1.9.1 — Search Controller</w:t>
-      </w:r>
-    </w:p>
-    <w:p>
-      <w:pPr>
-        <w:pStyle w:val="ListParagraph"/>
-        <w:numPr>
-          <w:ilvl w:val="1"/>
-          <w:numId w:val="2"/>
-        </w:numPr>
-        <w:cnfStyle w:val="000000100000" w:firstRow="0" w:lastRow="0" w:firstColumn="0" w:lastColumn="0" w:oddVBand="0" w:evenVBand="0" w:oddHBand="1" w:evenHBand="0" w:firstRowFirstColumn="0" w:firstRowLastColumn="0" w:lastRowFirstColumn="0" w:lastRowLastColumn="0"/>
-      </w:pPr>
-      <w:r>
-        <w:t>EI Table 1.9.2 — Candidate Search</w:t>
-      </w:r>
-    </w:p>
-    <w:p>
-      <w:pPr>
-        <w:pStyle w:val="ListParagraph"/>
-        <w:numPr>
-          <w:ilvl w:val="1"/>
-          <w:numId w:val="2"/>
-        </w:numPr>
-        <w:cnfStyle w:val="000000100000" w:firstRow="0" w:lastRow="0" w:firstColumn="0" w:lastColumn="0" w:oddVBand="0" w:evenVBand="0" w:oddHBand="1" w:evenHBand="0" w:firstRowFirstColumn="0" w:firstRowLastColumn="0" w:lastRowFirstColumn="0" w:lastRowLastColumn="0"/>
-      </w:pPr>
-      <w:r>
-        <w:t>EI Table 1.9.3 — Job Search</w:t>
-      </w:r>
-    </w:p>
-    <w:p>
-      <w:pPr>
-        <w:pStyle w:val="ListParagraph"/>
-        <w:numPr>
-          <w:ilvl w:val="1"/>
-          <w:numId w:val="2"/>
-        </w:numPr>
-        <w:cnfStyle w:val="000000100000" w:firstRow="0" w:lastRow="0" w:firstColumn="0" w:lastColumn="0" w:oddVBand="0" w:evenVBand="0" w:oddHBand="1" w:evenHBand="0" w:firstRowFirstColumn="0" w:firstRowLastColumn="0" w:lastRowFirstColumn="0" w:lastRowLastColumn="0"/>
-      </w:pPr>
-      <w:r>
-        <w:t>EI Table 1.9.4 — Company Search</w:t>
-      </w:r>
-    </w:p>
-    <w:p>
-      <w:pPr>
-        <w:pStyle w:val="ListParagraph"/>
-        <w:numPr>
-          <w:ilvl w:val="1"/>
-          <w:numId w:val="2"/>
-        </w:numPr>
-        <w:cnfStyle w:val="000000100000" w:firstRow="0" w:lastRow="0" w:firstColumn="0" w:lastColumn="0" w:oddVBand="0" w:evenVBand="0" w:oddHBand="1" w:evenHBand="0" w:firstRowFirstColumn="0" w:firstRowLastColumn="0" w:lastRowFirstColumn="0" w:lastRowLastColumn="0"/>
-      </w:pPr>
-      <w:r>
-        <w:t>EI Table 1.9.5 — Filter Processor</w:t>
-      </w:r>
-    </w:p>
-    <w:p>
-      <w:pPr>
-        <w:pStyle w:val="ListParagraph"/>
-        <w:numPr>
-          <w:ilvl w:val="1"/>
-          <w:numId w:val="2"/>
-        </w:numPr>
-        <w:cnfStyle w:val="000000100000" w:firstRow="0" w:lastRow="0" w:firstColumn="0" w:lastColumn="0" w:oddVBand="0" w:evenVBand="0" w:oddHBand="1" w:evenHBand="0" w:firstRowFirstColumn="0" w:firstRowLastColumn="0" w:lastRowFirstColumn="0" w:lastRowLastColumn="0"/>
-      </w:pPr>
-      <w:r>
-        <w:t>EI Table 1.9.6 — Advanced Search</w:t>
-      </w:r>
-    </w:p>
-    <w:p>
-      <w:pPr>
-        <w:pStyle w:val="ListParagraph"/>
-        <w:numPr>
-          <w:ilvl w:val="1"/>
-          <w:numId w:val="2"/>
-        </w:numPr>
-        <w:cnfStyle w:val="000000100000" w:firstRow="0" w:lastRow="0" w:firstColumn="0" w:lastColumn="0" w:oddVBand="0" w:evenVBand="0" w:oddHBand="1" w:evenHBand="0" w:firstRowFirstColumn="0" w:firstRowLastColumn="0" w:lastRowFirstColumn="0" w:lastRowLastColumn="0"/>
-      </w:pPr>
-      <w:r>
-        <w:t>EI Table 1.9.7 — Wildcard Search</w:t>
-      </w:r>
-    </w:p>
-    <w:p>
-      <w:pPr>
-        <w:pStyle w:val="ListParagraph"/>
-        <w:numPr>
-          <w:ilvl w:val="1"/>
-          <w:numId w:val="2"/>
-        </w:numPr>
-        <w:cnfStyle w:val="000000100000" w:firstRow="0" w:lastRow="0" w:firstColumn="0" w:lastColumn="0" w:oddVBand="0" w:evenVBand="0" w:oddHBand="1" w:evenHBand="0" w:firstRowFirstColumn="0" w:firstRowLastColumn="0" w:lastRowFirstColumn="0" w:lastRowLastColumn="0"/>
-      </w:pPr>
-      <w:r>
-        <w:t>EI Table 1.9.8 — Search Cache</w:t>
-      </w:r>
-    </w:p>
-    <w:p>
-      <w:pPr>
-        <w:pStyle w:val="ListParagraph"/>
-        <w:numPr>
-          <w:ilvl w:val="1"/>
-          <w:numId w:val="2"/>
-        </w:numPr>
-        <w:cnfStyle w:val="000000100000" w:firstRow="0" w:lastRow="0" w:firstColumn="0" w:lastColumn="0" w:oddVBand="0" w:evenVBand="0" w:oddHBand="1" w:evenHBand="0" w:firstRowFirstColumn="0" w:firstRowLastColumn="0" w:lastRowFirstColumn="0" w:lastRowLastColumn="0"/>
-      </w:pPr>
-      <w:r>
-        <w:t>EI Table 1.9.9 — Search Engine Adapter</w:t>
-      </w:r>
-    </w:p>
-    <w:p>
-      <w:pPr>
-        <w:pStyle w:val="ListParagraph"/>
-        <w:numPr>
-          <w:ilvl w:val="1"/>
-          <w:numId w:val="2"/>
-        </w:numPr>
-        <w:cnfStyle w:val="000000100000" w:firstRow="0" w:lastRow="0" w:firstColumn="0" w:lastColumn="0" w:oddVBand="0" w:evenVBand="0" w:oddHBand="1" w:evenHBand="0" w:firstRowFirstColumn="0" w:firstRowLastColumn="0" w:lastRowFirstColumn="0" w:lastRowLastColumn="0"/>
-      </w:pPr>
-      <w:r>
-        <w:t>EI Table 1.9.10 — Search Index / Search Engine</w:t>
-      </w:r>
-    </w:p>
-    <w:p>
-      <w:pPr>
-        <w:pStyle w:val="ListParagraph"/>
-        <w:numPr>
-          <w:ilvl w:val="1"/>
-          <w:numId w:val="2"/>
-        </w:numPr>
-        <w:cnfStyle w:val="000000100000" w:firstRow="0" w:lastRow="0" w:firstColumn="0" w:lastColumn="0" w:oddVBand="0" w:evenVBand="0" w:oddHBand="1" w:evenHBand="0" w:firstRowFirstColumn="0" w:firstRowLastColumn="0" w:lastRowFirstColumn="0" w:lastRowLastColumn="0"/>
-      </w:pPr>
-      <w:r>
-        <w:t>EI Table 1.9.11 — Autocomplete Component</w:t>
-      </w:r>
-    </w:p>
-    <w:p>
-      <w:pPr>
-        <w:pStyle w:val="ListParagraph"/>
-        <w:numPr>
-          <w:ilvl w:val="1"/>
-          <w:numId w:val="2"/>
-        </w:numPr>
-        <w:cnfStyle w:val="000000100000" w:firstRow="0" w:lastRow="0" w:firstColumn="0" w:lastColumn="0" w:oddVBand="0" w:evenVBand="0" w:oddHBand="1" w:evenHBand="0" w:firstRowFirstColumn="0" w:firstRowLastColumn="0" w:lastRowFirstColumn="0" w:lastRowLastColumn="0"/>
-      </w:pPr>
-      <w:r>
-        <w:t>EI Table 1.9.12 — Result Ranking</w:t>
-      </w:r>
-    </w:p>
-    <w:p>
-      <w:pPr>
-        <w:pStyle w:val="Alt1-Hd-2"/>
-      </w:pPr>
-      <w:r>
-        <w:t xml:space="preserve">Team </w:t>
-      </w:r>
-      <w:r>
-        <w:t>3</w:t>
-      </w:r>
-      <w:r>
-        <w:t xml:space="preserve"> (</w:t>
-      </w:r>
-      <w:r>
-        <w:t>Spencer Beals</w:t>
-      </w:r>
-      <w:r>
-        <w:t xml:space="preserve">) - Total </w:t>
-      </w:r>
-      <w:r>
-        <w:t xml:space="preserve">Entity Identification Tables </w:t>
-      </w:r>
-      <w:r>
-        <w:t>Count (</w:t>
-      </w:r>
-      <w:r>
-        <w:t>14</w:t>
-      </w:r>
-      <w:r>
-        <w:t>)</w:t>
-      </w:r>
-    </w:p>
-    <w:p>
-      <w:pPr>
-        <w:pStyle w:val="ListParagraph"/>
-        <w:numPr>
-          <w:ilvl w:val="0"/>
-          <w:numId w:val="2"/>
-        </w:numPr>
-        <w:cnfStyle w:val="000000100000" w:firstRow="0" w:lastRow="0" w:firstColumn="0" w:lastColumn="0" w:oddVBand="0" w:evenVBand="0" w:oddHBand="1" w:evenHBand="0" w:firstRowFirstColumn="0" w:firstRowLastColumn="0" w:lastRowFirstColumn="0" w:lastRowLastColumn="0"/>
-      </w:pPr>
-      <w:r>
-        <w:t xml:space="preserve">Entity Identification Tables </w:t>
-      </w:r>
-      <w:r>
-        <w:t>—</w:t>
-      </w:r>
-      <w:r>
-        <w:t xml:space="preserve"> </w:t>
-      </w:r>
-      <w:r>
-        <w:t>API Gateway / Orchestrator</w:t>
-      </w:r>
-      <w:r>
-        <w:t xml:space="preserve"> </w:t>
-      </w:r>
-      <w:r>
-        <w:t>(</w:t>
-      </w:r>
-      <w:r>
-        <w:t>6</w:t>
-      </w:r>
-      <w:r>
-        <w:t xml:space="preserve"> </w:t>
-      </w:r>
-      <w:r>
-        <w:t>Inner Components)</w:t>
-      </w:r>
-    </w:p>
-    <w:p>
-      <w:pPr>
-        <w:pStyle w:val="ListParagraph"/>
-        <w:numPr>
-          <w:ilvl w:val="1"/>
-          <w:numId w:val="2"/>
-        </w:numPr>
-        <w:cnfStyle w:val="000000100000" w:firstRow="0" w:lastRow="0" w:firstColumn="0" w:lastColumn="0" w:oddVBand="0" w:evenVBand="0" w:oddHBand="1" w:evenHBand="0" w:firstRowFirstColumn="0" w:firstRowLastColumn="0" w:lastRowFirstColumn="0" w:lastRowLastColumn="0"/>
-      </w:pPr>
-      <w:r>
-        <w:t>EI Table 1.4.1 — API Gateway</w:t>
-      </w:r>
-    </w:p>
-    <w:p>
-      <w:pPr>
-        <w:pStyle w:val="ListParagraph"/>
-        <w:numPr>
-          <w:ilvl w:val="1"/>
-          <w:numId w:val="2"/>
-        </w:numPr>
-        <w:cnfStyle w:val="000000100000" w:firstRow="0" w:lastRow="0" w:firstColumn="0" w:lastColumn="0" w:oddVBand="0" w:evenVBand="0" w:oddHBand="1" w:evenHBand="0" w:firstRowFirstColumn="0" w:firstRowLastColumn="0" w:lastRowFirstColumn="0" w:lastRowLastColumn="0"/>
-      </w:pPr>
-      <w:r>
-        <w:t>EI Table 1.4.2 — Authentication Handler</w:t>
-      </w:r>
-    </w:p>
-    <w:p>
-      <w:pPr>
-        <w:pStyle w:val="ListParagraph"/>
-        <w:numPr>
-          <w:ilvl w:val="1"/>
-          <w:numId w:val="2"/>
-        </w:numPr>
-        <w:cnfStyle w:val="000000100000" w:firstRow="0" w:lastRow="0" w:firstColumn="0" w:lastColumn="0" w:oddVBand="0" w:evenVBand="0" w:oddHBand="1" w:evenHBand="0" w:firstRowFirstColumn="0" w:firstRowLastColumn="0" w:lastRowFirstColumn="0" w:lastRowLastColumn="0"/>
-      </w:pPr>
-      <w:r>
-        <w:t xml:space="preserve">EI Table 1.4.3 — </w:t>
-      </w:r>
-      <w:r>
-        <w:t>Request Router</w:t>
-      </w:r>
-    </w:p>
-    <w:p>
-      <w:pPr>
-        <w:pStyle w:val="ListParagraph"/>
-        <w:numPr>
-          <w:ilvl w:val="1"/>
-          <w:numId w:val="2"/>
-        </w:numPr>
-        <w:cnfStyle w:val="000000100000" w:firstRow="0" w:lastRow="0" w:firstColumn="0" w:lastColumn="0" w:oddVBand="0" w:evenVBand="0" w:oddHBand="1" w:evenHBand="0" w:firstRowFirstColumn="0" w:firstRowLastColumn="0" w:lastRowFirstColumn="0" w:lastRowLastColumn="0"/>
-      </w:pPr>
-      <w:r>
-        <w:t xml:space="preserve">EI Table 1.4.4 — </w:t>
-      </w:r>
-      <w:r>
-        <w:t>Request Validator</w:t>
-      </w:r>
-    </w:p>
-    <w:p>
-      <w:pPr>
-        <w:pStyle w:val="ListParagraph"/>
-        <w:numPr>
-          <w:ilvl w:val="1"/>
-          <w:numId w:val="2"/>
-        </w:numPr>
-        <w:cnfStyle w:val="000000100000" w:firstRow="0" w:lastRow="0" w:firstColumn="0" w:lastColumn="0" w:oddVBand="0" w:evenVBand="0" w:oddHBand="1" w:evenHBand="0" w:firstRowFirstColumn="0" w:firstRowLastColumn="0" w:lastRowFirstColumn="0" w:lastRowLastColumn="0"/>
-      </w:pPr>
-      <w:r>
-        <w:t>EI Table 1.4.5 —</w:t>
-      </w:r>
-      <w:r>
-        <w:t xml:space="preserve"> </w:t>
-      </w:r>
-      <w:r>
-        <w:t>Service Orchestrator Pattern</w:t>
-      </w:r>
-    </w:p>
-    <w:p>
-      <w:pPr>
-        <w:pStyle w:val="ListParagraph"/>
-        <w:numPr>
-          <w:ilvl w:val="1"/>
-          <w:numId w:val="2"/>
-        </w:numPr>
-        <w:cnfStyle w:val="000000100000" w:firstRow="0" w:lastRow="0" w:firstColumn="0" w:lastColumn="0" w:oddVBand="0" w:evenVBand="0" w:oddHBand="1" w:evenHBand="0" w:firstRowFirstColumn="0" w:firstRowLastColumn="0" w:lastRowFirstColumn="0" w:lastRowLastColumn="0"/>
-      </w:pPr>
-      <w:r>
-        <w:t xml:space="preserve">EI Table 1.4.10 — </w:t>
-      </w:r>
-      <w:r>
-        <w:t>Communications Orchestrator</w:t>
-      </w:r>
-    </w:p>
-    <w:p>
-      <w:pPr>
-        <w:pStyle w:val="ListParagraph"/>
-        <w:numPr>
-          <w:ilvl w:val="2"/>
-          <w:numId w:val="2"/>
-        </w:numPr>
-        <w:cnfStyle w:val="000000100000" w:firstRow="0" w:lastRow="0" w:firstColumn="0" w:lastColumn="0" w:oddVBand="0" w:evenVBand="0" w:oddHBand="1" w:evenHBand="0" w:firstRowFirstColumn="0" w:firstRowLastColumn="0" w:lastRowFirstColumn="0" w:lastRowLastColumn="0"/>
-      </w:pPr>
-      <w:r>
-        <w:t>domain-specific entities</w:t>
-      </w:r>
-      <w:r>
-        <w:t xml:space="preserve"> in (</w:t>
-      </w:r>
-      <w:r>
-        <w:t>API Gateway / Orchestrator</w:t>
-      </w:r>
-      <w:r>
-        <w:t>)</w:t>
-      </w:r>
-    </w:p>
-    <w:p>
-      <w:pPr>
-        <w:pStyle w:val="ListParagraph"/>
-        <w:numPr>
-          <w:ilvl w:val="0"/>
-          <w:numId w:val="2"/>
-        </w:numPr>
-        <w:cnfStyle w:val="000000100000" w:firstRow="0" w:lastRow="0" w:firstColumn="0" w:lastColumn="0" w:oddVBand="0" w:evenVBand="0" w:oddHBand="1" w:evenHBand="0" w:firstRowFirstColumn="0" w:firstRowLastColumn="0" w:lastRowFirstColumn="0" w:lastRowLastColumn="0"/>
-      </w:pPr>
-      <w:r>
-        <w:t>Entity Identification Tables — Communication Services</w:t>
-      </w:r>
-      <w:r>
-        <w:t xml:space="preserve"> </w:t>
-      </w:r>
-      <w:r>
-        <w:t>(Notifications + News Feed)</w:t>
-      </w:r>
-      <w:r>
-        <w:t xml:space="preserve"> </w:t>
-      </w:r>
-      <w:r>
-        <w:t>(</w:t>
-      </w:r>
-      <w:r>
-        <w:t>8</w:t>
-      </w:r>
-      <w:r>
-        <w:t xml:space="preserve"> </w:t>
-      </w:r>
-      <w:r>
-        <w:t>Inner Components)</w:t>
-      </w:r>
-    </w:p>
-    <w:p>
-      <w:pPr>
-        <w:pStyle w:val="ListParagraph"/>
-        <w:numPr>
-          <w:ilvl w:val="1"/>
-          <w:numId w:val="2"/>
-        </w:numPr>
-        <w:cnfStyle w:val="000000100000" w:firstRow="0" w:lastRow="0" w:firstColumn="0" w:lastColumn="0" w:oddVBand="0" w:evenVBand="0" w:oddHBand="1" w:evenHBand="0" w:firstRowFirstColumn="0" w:firstRowLastColumn="0" w:lastRowFirstColumn="0" w:lastRowLastColumn="0"/>
-      </w:pPr>
-      <w:r>
-        <w:t>EI Table 1.10.1 — Event Listener</w:t>
-      </w:r>
-    </w:p>
-    <w:p>
-      <w:pPr>
-        <w:pStyle w:val="ListParagraph"/>
-        <w:numPr>
-          <w:ilvl w:val="1"/>
-          <w:numId w:val="2"/>
-        </w:numPr>
-        <w:cnfStyle w:val="000000100000" w:firstRow="0" w:lastRow="0" w:firstColumn="0" w:lastColumn="0" w:oddVBand="0" w:evenVBand="0" w:oddHBand="1" w:evenHBand="0" w:firstRowFirstColumn="0" w:firstRowLastColumn="0" w:lastRowFirstColumn="0" w:lastRowLastColumn="0"/>
-      </w:pPr>
-      <w:r>
-        <w:t>EI Table 1.10.2 — Notification Controller</w:t>
-      </w:r>
-    </w:p>
-    <w:p>
-      <w:pPr>
-        <w:pStyle w:val="ListParagraph"/>
-        <w:numPr>
-          <w:ilvl w:val="1"/>
-          <w:numId w:val="2"/>
-        </w:numPr>
-        <w:cnfStyle w:val="000000100000" w:firstRow="0" w:lastRow="0" w:firstColumn="0" w:lastColumn="0" w:oddVBand="0" w:evenVBand="0" w:oddHBand="1" w:evenHBand="0" w:firstRowFirstColumn="0" w:firstRowLastColumn="0" w:lastRowFirstColumn="0" w:lastRowLastColumn="0"/>
-      </w:pPr>
-      <w:r>
-        <w:t>EI Table 1.10.3 — Notification Orchestrator</w:t>
-      </w:r>
-    </w:p>
-    <w:p>
-      <w:pPr>
-        <w:pStyle w:val="ListParagraph"/>
-        <w:numPr>
-          <w:ilvl w:val="1"/>
-          <w:numId w:val="2"/>
-        </w:numPr>
-        <w:cnfStyle w:val="000000100000" w:firstRow="0" w:lastRow="0" w:firstColumn="0" w:lastColumn="0" w:oddVBand="0" w:evenVBand="0" w:oddHBand="1" w:evenHBand="0" w:firstRowFirstColumn="0" w:firstRowLastColumn="0" w:lastRowFirstColumn="0" w:lastRowLastColumn="0"/>
-      </w:pPr>
-      <w:r>
-        <w:t>EI Table 1.10.4 — Notification Formatter</w:t>
-      </w:r>
-    </w:p>
-    <w:p>
-      <w:pPr>
-        <w:pStyle w:val="ListParagraph"/>
-        <w:numPr>
-          <w:ilvl w:val="1"/>
-          <w:numId w:val="2"/>
-        </w:numPr>
-        <w:cnfStyle w:val="000000100000" w:firstRow="0" w:lastRow="0" w:firstColumn="0" w:lastColumn="0" w:oddVBand="0" w:evenVBand="0" w:oddHBand="1" w:evenHBand="0" w:firstRowFirstColumn="0" w:firstRowLastColumn="0" w:lastRowFirstColumn="0" w:lastRowLastColumn="0"/>
-      </w:pPr>
-      <w:r>
-        <w:t>EI Table 1.10.5 — Notification Repository</w:t>
-      </w:r>
-    </w:p>
-    <w:p>
-      <w:pPr>
-        <w:pStyle w:val="ListParagraph"/>
-        <w:numPr>
-          <w:ilvl w:val="1"/>
-          <w:numId w:val="2"/>
-        </w:numPr>
-        <w:cnfStyle w:val="000000100000" w:firstRow="0" w:lastRow="0" w:firstColumn="0" w:lastColumn="0" w:oddVBand="0" w:evenVBand="0" w:oddHBand="1" w:evenHBand="0" w:firstRowFirstColumn="0" w:firstRowLastColumn="0" w:lastRowFirstColumn="0" w:lastRowLastColumn="0"/>
-      </w:pPr>
-      <w:r>
-        <w:t>EI Table 1.10.6 — Recipient Resolver</w:t>
-      </w:r>
-    </w:p>
-    <w:p>
-      <w:pPr>
-        <w:pStyle w:val="ListParagraph"/>
-        <w:numPr>
-          <w:ilvl w:val="1"/>
-          <w:numId w:val="2"/>
-        </w:numPr>
-        <w:cnfStyle w:val="000000100000" w:firstRow="0" w:lastRow="0" w:firstColumn="0" w:lastColumn="0" w:oddVBand="0" w:evenVBand="0" w:oddHBand="1" w:evenHBand="0" w:firstRowFirstColumn="0" w:firstRowLastColumn="0" w:lastRowFirstColumn="0" w:lastRowLastColumn="0"/>
-      </w:pPr>
-      <w:r>
-        <w:t>EI Table 1.10.7 — Push Delivery Component</w:t>
-      </w:r>
-    </w:p>
-    <w:p>
-      <w:pPr>
-        <w:pStyle w:val="ListParagraph"/>
-        <w:numPr>
-          <w:ilvl w:val="1"/>
-          <w:numId w:val="2"/>
-        </w:numPr>
-        <w:cnfStyle w:val="000000100000" w:firstRow="0" w:lastRow="0" w:firstColumn="0" w:lastColumn="0" w:oddVBand="0" w:evenVBand="0" w:oddHBand="1" w:evenHBand="0" w:firstRowFirstColumn="0" w:firstRowLastColumn="0" w:lastRowFirstColumn="0" w:lastRowLastColumn="0"/>
-      </w:pPr>
-      <w:r>
-        <w:t>EI Table 1.10.8 — News Feed Manager</w:t>
-      </w:r>
-    </w:p>
-    <w:p>
-      <w:pPr>
-        <w:pStyle w:val="Alt1-Hd-2"/>
-      </w:pPr>
-      <w:r>
-        <w:lastRenderedPageBreak/>
-        <w:t xml:space="preserve">Team </w:t>
-      </w:r>
-      <w:r>
-        <w:t>4</w:t>
-      </w:r>
-      <w:r>
-        <w:t xml:space="preserve"> (</w:t>
-      </w:r>
-      <w:r>
-        <w:t>Kimberly Uresti</w:t>
-      </w:r>
-      <w:r>
-        <w:t xml:space="preserve">) - Total </w:t>
-      </w:r>
-      <w:r>
-        <w:t xml:space="preserve">Entity Identification Tables </w:t>
-      </w:r>
-      <w:r>
-        <w:t>Count (</w:t>
-      </w:r>
-      <w:r>
-        <w:t>10</w:t>
-      </w:r>
-      <w:r>
-        <w:t>)</w:t>
-      </w:r>
-    </w:p>
-    <w:p>
-      <w:pPr>
-        <w:pStyle w:val="ListParagraph"/>
-        <w:numPr>
-          <w:ilvl w:val="0"/>
-          <w:numId w:val="2"/>
-        </w:numPr>
-      </w:pPr>
-      <w:r>
-        <w:t>Entity Identification Tables — API Gateway / Orchestrator (</w:t>
-      </w:r>
-      <w:r>
-        <w:t>1</w:t>
-      </w:r>
-      <w:r>
-        <w:t xml:space="preserve"> Inner Components)</w:t>
-      </w:r>
-    </w:p>
-    <w:p>
-      <w:pPr>
-        <w:pStyle w:val="ListParagraph"/>
-        <w:numPr>
-          <w:ilvl w:val="1"/>
-          <w:numId w:val="2"/>
-        </w:numPr>
-        <w:cnfStyle w:val="000000100000" w:firstRow="0" w:lastRow="0" w:firstColumn="0" w:lastColumn="0" w:oddVBand="0" w:evenVBand="0" w:oddHBand="1" w:evenHBand="0" w:firstRowFirstColumn="0" w:firstRowLastColumn="0" w:lastRowFirstColumn="0" w:lastRowLastColumn="0"/>
-      </w:pPr>
-      <w:r>
-        <w:t xml:space="preserve">EI Table 1.4.6 — </w:t>
-      </w:r>
-      <w:r>
-        <w:t>Profile Orchestrator</w:t>
-      </w:r>
-    </w:p>
-    <w:p>
-      <w:pPr>
-        <w:pStyle w:val="ListParagraph"/>
-        <w:numPr>
-          <w:ilvl w:val="2"/>
-          <w:numId w:val="2"/>
-        </w:numPr>
-        <w:cnfStyle w:val="000000100000" w:firstRow="0" w:lastRow="0" w:firstColumn="0" w:lastColumn="0" w:oddVBand="0" w:evenVBand="0" w:oddHBand="1" w:evenHBand="0" w:firstRowFirstColumn="0" w:firstRowLastColumn="0" w:lastRowFirstColumn="0" w:lastRowLastColumn="0"/>
-      </w:pPr>
-      <w:r>
-        <w:t>domain-specific entities in (</w:t>
-      </w:r>
-      <w:r>
-        <w:t>API Gateway / Orchestrator</w:t>
-      </w:r>
-      <w:r>
-        <w:t>)</w:t>
-      </w:r>
-    </w:p>
-    <w:p>
-      <w:pPr>
-        <w:pStyle w:val="ListParagraph"/>
-        <w:numPr>
-          <w:ilvl w:val="0"/>
-          <w:numId w:val="2"/>
-        </w:numPr>
-      </w:pPr>
-      <w:r>
-        <w:t>Entity Identification Tables — Authentication Service</w:t>
-      </w:r>
-      <w:r>
-        <w:t xml:space="preserve"> (</w:t>
-      </w:r>
-      <w:r>
-        <w:t>4</w:t>
-      </w:r>
-      <w:r>
-        <w:t xml:space="preserve"> </w:t>
-      </w:r>
-      <w:r>
-        <w:t>Inner Components)</w:t>
-      </w:r>
-    </w:p>
-    <w:p>
-      <w:pPr>
-        <w:pStyle w:val="ListParagraph"/>
-        <w:numPr>
-          <w:ilvl w:val="1"/>
-          <w:numId w:val="2"/>
-        </w:numPr>
-        <w:cnfStyle w:val="000000100000" w:firstRow="0" w:lastRow="0" w:firstColumn="0" w:lastColumn="0" w:oddVBand="0" w:evenVBand="0" w:oddHBand="1" w:evenHBand="0" w:firstRowFirstColumn="0" w:firstRowLastColumn="0" w:lastRowFirstColumn="0" w:lastRowLastColumn="0"/>
-      </w:pPr>
-      <w:r>
-        <w:t>EI Table 1.5.1 — Registration Manager</w:t>
-      </w:r>
-    </w:p>
-    <w:p>
-      <w:pPr>
-        <w:pStyle w:val="ListParagraph"/>
-        <w:numPr>
-          <w:ilvl w:val="1"/>
-          <w:numId w:val="2"/>
-        </w:numPr>
-        <w:cnfStyle w:val="000000100000" w:firstRow="0" w:lastRow="0" w:firstColumn="0" w:lastColumn="0" w:oddVBand="0" w:evenVBand="0" w:oddHBand="1" w:evenHBand="0" w:firstRowFirstColumn="0" w:firstRowLastColumn="0" w:lastRowFirstColumn="0" w:lastRowLastColumn="0"/>
-      </w:pPr>
-      <w:r>
-        <w:t>EI Table 1.5.2 — Authorization / Role Manager</w:t>
-      </w:r>
-    </w:p>
-    <w:p>
-      <w:pPr>
-        <w:pStyle w:val="ListParagraph"/>
-        <w:numPr>
-          <w:ilvl w:val="1"/>
-          <w:numId w:val="2"/>
-        </w:numPr>
-        <w:cnfStyle w:val="000000100000" w:firstRow="0" w:lastRow="0" w:firstColumn="0" w:lastColumn="0" w:oddVBand="0" w:evenVBand="0" w:oddHBand="1" w:evenHBand="0" w:firstRowFirstColumn="0" w:firstRowLastColumn="0" w:lastRowFirstColumn="0" w:lastRowLastColumn="0"/>
-      </w:pPr>
-      <w:r>
-        <w:t>EI Table 1.5.3 — Login &amp; Session Manager</w:t>
-      </w:r>
-    </w:p>
-    <w:p>
-      <w:pPr>
-        <w:pStyle w:val="ListParagraph"/>
-        <w:numPr>
-          <w:ilvl w:val="1"/>
-          <w:numId w:val="2"/>
-        </w:numPr>
-        <w:cnfStyle w:val="000000100000" w:firstRow="0" w:lastRow="0" w:firstColumn="0" w:lastColumn="0" w:oddVBand="0" w:evenVBand="0" w:oddHBand="1" w:evenHBand="0" w:firstRowFirstColumn="0" w:firstRowLastColumn="0" w:lastRowFirstColumn="0" w:lastRowLastColumn="0"/>
-      </w:pPr>
-      <w:r>
-        <w:t>EI Table 1.5.4 — Security Audit Logger</w:t>
-      </w:r>
-    </w:p>
-    <w:p>
-      <w:pPr>
-        <w:pStyle w:val="ListParagraph"/>
-        <w:numPr>
-          <w:ilvl w:val="0"/>
-          <w:numId w:val="2"/>
-        </w:numPr>
-        <w:cnfStyle w:val="000000100000" w:firstRow="0" w:lastRow="0" w:firstColumn="0" w:lastColumn="0" w:oddVBand="0" w:evenVBand="0" w:oddHBand="1" w:evenHBand="0" w:firstRowFirstColumn="0" w:firstRowLastColumn="0" w:lastRowFirstColumn="0" w:lastRowLastColumn="0"/>
-      </w:pPr>
-      <w:r>
-        <w:t>Entity Identification Tables — Profile Management</w:t>
-      </w:r>
-      <w:r>
-        <w:t xml:space="preserve"> </w:t>
-      </w:r>
-      <w:r>
-        <w:t>(</w:t>
-      </w:r>
-      <w:r>
-        <w:t>5</w:t>
-      </w:r>
-      <w:r>
-        <w:t xml:space="preserve"> </w:t>
-      </w:r>
-      <w:r>
-        <w:t>Inner Components)</w:t>
-      </w:r>
-    </w:p>
-    <w:p>
-      <w:pPr>
-        <w:pStyle w:val="ListParagraph"/>
-        <w:numPr>
-          <w:ilvl w:val="1"/>
-          <w:numId w:val="2"/>
-        </w:numPr>
-        <w:cnfStyle w:val="000000100000" w:firstRow="0" w:lastRow="0" w:firstColumn="0" w:lastColumn="0" w:oddVBand="0" w:evenVBand="0" w:oddHBand="1" w:evenHBand="0" w:firstRowFirstColumn="0" w:firstRowLastColumn="0" w:lastRowFirstColumn="0" w:lastRowLastColumn="0"/>
-      </w:pPr>
-      <w:r>
-        <w:t xml:space="preserve">Profile </w:t>
-      </w:r>
-      <w:proofErr w:type="spellStart"/>
-      <w:r>
-        <w:t>Manager</w:t>
-      </w:r>
-      <w:r>
-        <w:t>EI</w:t>
-      </w:r>
-      <w:proofErr w:type="spellEnd"/>
-      <w:r>
-        <w:t xml:space="preserve"> Table 1.6.1 — Profile Manager</w:t>
-      </w:r>
-    </w:p>
-    <w:p>
-      <w:pPr>
-        <w:pStyle w:val="ListParagraph"/>
-        <w:numPr>
-          <w:ilvl w:val="1"/>
-          <w:numId w:val="2"/>
-        </w:numPr>
-        <w:cnfStyle w:val="000000100000" w:firstRow="0" w:lastRow="0" w:firstColumn="0" w:lastColumn="0" w:oddVBand="0" w:evenVBand="0" w:oddHBand="1" w:evenHBand="0" w:firstRowFirstColumn="0" w:firstRowLastColumn="0" w:lastRowFirstColumn="0" w:lastRowLastColumn="0"/>
-      </w:pPr>
-      <w:r>
-        <w:t>EI Table 1.6.2 — Image Manager</w:t>
-      </w:r>
-    </w:p>
-    <w:p>
-      <w:pPr>
-        <w:pStyle w:val="ListParagraph"/>
-        <w:numPr>
-          <w:ilvl w:val="1"/>
-          <w:numId w:val="2"/>
-        </w:numPr>
-        <w:cnfStyle w:val="000000100000" w:firstRow="0" w:lastRow="0" w:firstColumn="0" w:lastColumn="0" w:oddVBand="0" w:evenVBand="0" w:oddHBand="1" w:evenHBand="0" w:firstRowFirstColumn="0" w:firstRowLastColumn="0" w:lastRowFirstColumn="0" w:lastRowLastColumn="0"/>
-      </w:pPr>
-      <w:r>
-        <w:t>EI Table 1.6.3 — Preferences Manager</w:t>
-      </w:r>
-    </w:p>
-    <w:p>
-      <w:pPr>
-        <w:pStyle w:val="ListParagraph"/>
-        <w:numPr>
-          <w:ilvl w:val="1"/>
-          <w:numId w:val="2"/>
-        </w:numPr>
-        <w:cnfStyle w:val="000000100000" w:firstRow="0" w:lastRow="0" w:firstColumn="0" w:lastColumn="0" w:oddVBand="0" w:evenVBand="0" w:oddHBand="1" w:evenHBand="0" w:firstRowFirstColumn="0" w:firstRowLastColumn="0" w:lastRowFirstColumn="0" w:lastRowLastColumn="0"/>
-      </w:pPr>
-      <w:r>
-        <w:t>EI Table 1.6.4 — Privacy Settings Manager</w:t>
-      </w:r>
-    </w:p>
-    <w:p>
-      <w:pPr>
-        <w:pStyle w:val="ListParagraph"/>
-        <w:numPr>
-          <w:ilvl w:val="1"/>
-          <w:numId w:val="2"/>
-        </w:numPr>
-        <w:cnfStyle w:val="000000100000" w:firstRow="0" w:lastRow="0" w:firstColumn="0" w:lastColumn="0" w:oddVBand="0" w:evenVBand="0" w:oddHBand="1" w:evenHBand="0" w:firstRowFirstColumn="0" w:firstRowLastColumn="0" w:lastRowFirstColumn="0" w:lastRowLastColumn="0"/>
-      </w:pPr>
-      <w:r>
-        <w:t>EI Table 1.6.5 — Profile Audit Logger</w:t>
-      </w:r>
-    </w:p>
-    <w:p>
-      <w:pPr>
-        <w:pStyle w:val="Alt1-Hd-2"/>
-      </w:pPr>
-      <w:r>
-        <w:t xml:space="preserve">Team </w:t>
-      </w:r>
-      <w:r>
-        <w:t>5</w:t>
-      </w:r>
-      <w:r>
-        <w:t xml:space="preserve"> (</w:t>
-      </w:r>
-      <w:r>
-        <w:t>Adam Sheridan</w:t>
-      </w:r>
-      <w:r>
-        <w:t xml:space="preserve">) - Total </w:t>
-      </w:r>
-      <w:r>
-        <w:t xml:space="preserve">Entity Identification Tables </w:t>
-      </w:r>
-      <w:r>
-        <w:t>Count (</w:t>
-      </w:r>
-      <w:r>
-        <w:t>10</w:t>
-      </w:r>
-      <w:r>
-        <w:t>)</w:t>
-      </w:r>
-    </w:p>
-    <w:p>
-      <w:pPr>
-        <w:pStyle w:val="ListParagraph"/>
-        <w:numPr>
-          <w:ilvl w:val="0"/>
-          <w:numId w:val="2"/>
-        </w:numPr>
-      </w:pPr>
-      <w:r>
-        <w:t>Entity Identification Tables — API Gateway / Orchestrator (</w:t>
-      </w:r>
-      <w:r>
-        <w:t>2</w:t>
-      </w:r>
-      <w:r>
-        <w:t xml:space="preserve"> Inner Components)</w:t>
-      </w:r>
-    </w:p>
-    <w:p>
-      <w:pPr>
-        <w:pStyle w:val="ListParagraph"/>
-        <w:numPr>
-          <w:ilvl w:val="1"/>
-          <w:numId w:val="2"/>
-        </w:numPr>
-        <w:cnfStyle w:val="000000100000" w:firstRow="0" w:lastRow="0" w:firstColumn="0" w:lastColumn="0" w:oddVBand="0" w:evenVBand="0" w:oddHBand="1" w:evenHBand="0" w:firstRowFirstColumn="0" w:firstRowLastColumn="0" w:lastRowFirstColumn="0" w:lastRowLastColumn="0"/>
-      </w:pPr>
-      <w:r>
-        <w:t xml:space="preserve">EI Table 1.4.12 — </w:t>
-      </w:r>
-      <w:r>
-        <w:t>External Services Orchestrator</w:t>
-      </w:r>
-    </w:p>
-    <w:p>
-      <w:pPr>
-        <w:pStyle w:val="ListParagraph"/>
-        <w:numPr>
-          <w:ilvl w:val="2"/>
-          <w:numId w:val="2"/>
-        </w:numPr>
-        <w:cnfStyle w:val="000000100000" w:firstRow="0" w:lastRow="0" w:firstColumn="0" w:lastColumn="0" w:oddVBand="0" w:evenVBand="0" w:oddHBand="1" w:evenHBand="0" w:firstRowFirstColumn="0" w:firstRowLastColumn="0" w:lastRowFirstColumn="0" w:lastRowLastColumn="0"/>
-      </w:pPr>
-      <w:r>
-        <w:t>domain-specific entities in (API Gateway / Orchestrator)</w:t>
-      </w:r>
-    </w:p>
-    <w:p>
-      <w:pPr>
-        <w:pStyle w:val="ListParagraph"/>
-        <w:numPr>
-          <w:ilvl w:val="1"/>
-          <w:numId w:val="2"/>
-        </w:numPr>
-      </w:pPr>
-      <w:r>
-        <w:t xml:space="preserve">EI Table 1.4.13 — </w:t>
-      </w:r>
-      <w:r>
-        <w:t>Analytics Orchestrator</w:t>
-      </w:r>
-    </w:p>
-    <w:p>
-      <w:pPr>
-        <w:pStyle w:val="ListParagraph"/>
-        <w:numPr>
-          <w:ilvl w:val="2"/>
-          <w:numId w:val="2"/>
-        </w:numPr>
-      </w:pPr>
-      <w:r>
-        <w:t>domain-specific entities in (API Gateway / Orchestrator)</w:t>
-      </w:r>
-    </w:p>
-    <w:p>
-      <w:pPr>
-        <w:pStyle w:val="ListParagraph"/>
-        <w:numPr>
-          <w:ilvl w:val="0"/>
-          <w:numId w:val="2"/>
-        </w:numPr>
-      </w:pPr>
-      <w:r>
-        <w:t>Entity Identification Tables — External Services</w:t>
-      </w:r>
-      <w:r>
-        <w:t xml:space="preserve"> </w:t>
-      </w:r>
-      <w:r>
-        <w:t>(</w:t>
-      </w:r>
-      <w:r>
-        <w:t>3</w:t>
-      </w:r>
-      <w:r>
-        <w:t xml:space="preserve"> </w:t>
-      </w:r>
-      <w:r>
-        <w:t>Inner Components)</w:t>
-      </w:r>
-    </w:p>
-    <w:p>
-      <w:pPr>
-        <w:pStyle w:val="ListParagraph"/>
-        <w:numPr>
-          <w:ilvl w:val="1"/>
-          <w:numId w:val="2"/>
-        </w:numPr>
-        <w:cnfStyle w:val="000000100000" w:firstRow="0" w:lastRow="0" w:firstColumn="0" w:lastColumn="0" w:oddVBand="0" w:evenVBand="0" w:oddHBand="1" w:evenHBand="0" w:firstRowFirstColumn="0" w:firstRowLastColumn="0" w:lastRowFirstColumn="0" w:lastRowLastColumn="0"/>
-      </w:pPr>
-      <w:r>
-        <w:t>EI Table 1.11.1 — USPS Address Validation Adapter</w:t>
-      </w:r>
-    </w:p>
-    <w:p>
-      <w:pPr>
-        <w:pStyle w:val="ListParagraph"/>
-        <w:numPr>
-          <w:ilvl w:val="1"/>
-          <w:numId w:val="2"/>
-        </w:numPr>
-        <w:cnfStyle w:val="000000100000" w:firstRow="0" w:lastRow="0" w:firstColumn="0" w:lastColumn="0" w:oddVBand="0" w:evenVBand="0" w:oddHBand="1" w:evenHBand="0" w:firstRowFirstColumn="0" w:firstRowLastColumn="0" w:lastRowFirstColumn="0" w:lastRowLastColumn="0"/>
-      </w:pPr>
-      <w:r>
-        <w:t>EI Table 1.11.2 — Autocomplete API Adapter</w:t>
-      </w:r>
-    </w:p>
-    <w:p>
-      <w:pPr>
-        <w:pStyle w:val="ListParagraph"/>
-        <w:numPr>
-          <w:ilvl w:val="1"/>
-          <w:numId w:val="2"/>
-        </w:numPr>
-        <w:cnfStyle w:val="000000100000" w:firstRow="0" w:lastRow="0" w:firstColumn="0" w:lastColumn="0" w:oddVBand="0" w:evenVBand="0" w:oddHBand="1" w:evenHBand="0" w:firstRowFirstColumn="0" w:firstRowLastColumn="0" w:lastRowFirstColumn="0" w:lastRowLastColumn="0"/>
-      </w:pPr>
-      <w:r>
-        <w:t>EI Table 1.11.3 — Push Notification Gateway</w:t>
-      </w:r>
-    </w:p>
-    <w:p>
-      <w:pPr>
-        <w:pStyle w:val="ListParagraph"/>
-        <w:numPr>
-          <w:ilvl w:val="0"/>
-          <w:numId w:val="2"/>
-        </w:numPr>
-      </w:pPr>
-      <w:r>
-        <w:t>Entity Identification Tables — Analytics Service</w:t>
-      </w:r>
-      <w:r>
-        <w:t xml:space="preserve"> </w:t>
-      </w:r>
-      <w:r>
-        <w:t>(</w:t>
-      </w:r>
-      <w:r>
-        <w:t>5</w:t>
-      </w:r>
-      <w:r>
-        <w:t xml:space="preserve"> </w:t>
-      </w:r>
-      <w:r>
-        <w:t>Inner Components)</w:t>
-      </w:r>
-    </w:p>
-    <w:p>
-      <w:pPr>
-        <w:pStyle w:val="ListParagraph"/>
-        <w:numPr>
-          <w:ilvl w:val="1"/>
-          <w:numId w:val="2"/>
-        </w:numPr>
-        <w:cnfStyle w:val="000000100000" w:firstRow="0" w:lastRow="0" w:firstColumn="0" w:lastColumn="0" w:oddVBand="0" w:evenVBand="0" w:oddHBand="1" w:evenHBand="0" w:firstRowFirstColumn="0" w:firstRowLastColumn="0" w:lastRowFirstColumn="0" w:lastRowLastColumn="0"/>
-      </w:pPr>
-      <w:r>
-        <w:t>EI Table 1.12.1 — Job Posting Analytics</w:t>
-      </w:r>
-    </w:p>
-    <w:p>
-      <w:pPr>
-        <w:pStyle w:val="ListParagraph"/>
-        <w:numPr>
-          <w:ilvl w:val="1"/>
-          <w:numId w:val="2"/>
-        </w:numPr>
-        <w:cnfStyle w:val="000000100000" w:firstRow="0" w:lastRow="0" w:firstColumn="0" w:lastColumn="0" w:oddVBand="0" w:evenVBand="0" w:oddHBand="1" w:evenHBand="0" w:firstRowFirstColumn="0" w:firstRowLastColumn="0" w:lastRowFirstColumn="0" w:lastRowLastColumn="0"/>
-      </w:pPr>
-      <w:r>
-        <w:t>EI Table 1.12.2 — Search and Candidate Analytics</w:t>
-      </w:r>
-    </w:p>
-    <w:p>
-      <w:pPr>
-        <w:pStyle w:val="ListParagraph"/>
-        <w:numPr>
-          <w:ilvl w:val="1"/>
-          <w:numId w:val="2"/>
-        </w:numPr>
-        <w:cnfStyle w:val="000000100000" w:firstRow="0" w:lastRow="0" w:firstColumn="0" w:lastColumn="0" w:oddVBand="0" w:evenVBand="0" w:oddHBand="1" w:evenHBand="0" w:firstRowFirstColumn="0" w:firstRowLastColumn="0" w:lastRowFirstColumn="0" w:lastRowLastColumn="0"/>
-      </w:pPr>
-      <w:r>
-        <w:t>EI Table 1.12.3 — Profile and Resume Engagement</w:t>
-      </w:r>
-    </w:p>
-    <w:p>
-      <w:pPr>
-        <w:pStyle w:val="ListParagraph"/>
-        <w:numPr>
-          <w:ilvl w:val="1"/>
-          <w:numId w:val="2"/>
-        </w:numPr>
-        <w:cnfStyle w:val="000000100000" w:firstRow="0" w:lastRow="0" w:firstColumn="0" w:lastColumn="0" w:oddVBand="0" w:evenVBand="0" w:oddHBand="1" w:evenHBand="0" w:firstRowFirstColumn="0" w:firstRowLastColumn="0" w:lastRowFirstColumn="0" w:lastRowLastColumn="0"/>
-      </w:pPr>
-      <w:r>
-        <w:t>EI Table 1.12.4 — Notification and News Feed Analytics</w:t>
-      </w:r>
-    </w:p>
-    <w:p>
-      <w:pPr>
-        <w:pStyle w:val="ListParagraph"/>
-        <w:numPr>
-          <w:ilvl w:val="1"/>
-          <w:numId w:val="2"/>
-        </w:numPr>
-        <w:cnfStyle w:val="000000100000" w:firstRow="0" w:lastRow="0" w:firstColumn="0" w:lastColumn="0" w:oddVBand="0" w:evenVBand="0" w:oddHBand="1" w:evenHBand="0" w:firstRowFirstColumn="0" w:firstRowLastColumn="0" w:lastRowFirstColumn="0" w:lastRowLastColumn="0"/>
-      </w:pPr>
-      <w:r>
-        <w:t>EI Table 1.12.5 — Performance Monitor</w:t>
-      </w:r>
-    </w:p>
-    <w:p>
-      <w:pPr>
-        <w:pStyle w:val="Alt1-Hd-2"/>
-      </w:pPr>
-      <w:r>
-        <w:t xml:space="preserve">Team </w:t>
-      </w:r>
-      <w:r>
-        <w:t>6</w:t>
-      </w:r>
-      <w:r>
-        <w:t xml:space="preserve"> (</w:t>
-      </w:r>
-      <w:r>
-        <w:t>Marco Quintero</w:t>
-      </w:r>
-      <w:r>
-        <w:t xml:space="preserve">) - Total </w:t>
-      </w:r>
-      <w:r>
-        <w:t xml:space="preserve">Entity Identification Tables </w:t>
-      </w:r>
-      <w:r>
-        <w:t>Count (</w:t>
-      </w:r>
-      <w:r>
-        <w:t>1</w:t>
-      </w:r>
-      <w:r>
-        <w:t>3</w:t>
-      </w:r>
-      <w:r>
-        <w:t>)</w:t>
-      </w:r>
-    </w:p>
-    <w:p>
-      <w:pPr>
-        <w:pStyle w:val="ListParagraph"/>
-        <w:numPr>
-          <w:ilvl w:val="0"/>
-          <w:numId w:val="2"/>
-        </w:numPr>
-      </w:pPr>
-      <w:r>
-        <w:t>Entity Identification Tables — API Gateway / Orchestrator (</w:t>
-      </w:r>
-      <w:r>
-        <w:t>2</w:t>
-      </w:r>
-      <w:r>
-        <w:t xml:space="preserve"> Inner Components)</w:t>
-      </w:r>
-    </w:p>
-    <w:p>
-      <w:pPr>
-        <w:pStyle w:val="ListParagraph"/>
-        <w:numPr>
-          <w:ilvl w:val="1"/>
-          <w:numId w:val="2"/>
-        </w:numPr>
-      </w:pPr>
-      <w:r>
-        <w:t xml:space="preserve">EI Table 1.4.7 — </w:t>
-      </w:r>
-      <w:r>
-        <w:t>Resume Orchestrator</w:t>
-      </w:r>
-    </w:p>
-    <w:p>
-      <w:pPr>
-        <w:pStyle w:val="ListParagraph"/>
-        <w:numPr>
-          <w:ilvl w:val="2"/>
-          <w:numId w:val="2"/>
-        </w:numPr>
-      </w:pPr>
-      <w:r>
-        <w:t>domain-specific entities</w:t>
-      </w:r>
-      <w:r>
-        <w:t xml:space="preserve"> in (</w:t>
-      </w:r>
-      <w:r>
-        <w:t>API Gateway / Orchestrator</w:t>
-      </w:r>
-      <w:r>
-        <w:t>)</w:t>
-      </w:r>
-    </w:p>
-    <w:p>
-      <w:pPr>
-        <w:pStyle w:val="ListParagraph"/>
-        <w:numPr>
-          <w:ilvl w:val="1"/>
-          <w:numId w:val="2"/>
-        </w:numPr>
-      </w:pPr>
-      <w:r>
-        <w:t xml:space="preserve">EI Table 1.4.11 — </w:t>
+          <w:ilvl w:val="1"/>
+          <w:numId w:val="2"/>
+        </w:numPr>
+      </w:pPr>
+      <w:r>
+        <w:t>EI Table 1.4.1</w:t>
+      </w:r>
+      <w:r>
+        <w:t>0</w:t>
+      </w:r>
+      <w:r>
+        <w:t xml:space="preserve"> — </w:t>
       </w:r>
       <w:r>
         <w:t>Recommendation Orchestrator</w:t>
@@ -3787,13 +3543,181 @@
         <w:t>Entity Identification Tables — Resume Service</w:t>
       </w:r>
       <w:r>
+        <w:t xml:space="preserve"> (</w:t>
+      </w:r>
+      <w:r>
+        <w:t>6</w:t>
+      </w:r>
+      <w:r>
         <w:t xml:space="preserve"> </w:t>
       </w:r>
       <w:r>
+        <w:t>Inner Components)</w:t>
+      </w:r>
+    </w:p>
+    <w:p>
+      <w:pPr>
+        <w:pStyle w:val="ListParagraph"/>
+        <w:numPr>
+          <w:ilvl w:val="1"/>
+          <w:numId w:val="2"/>
+        </w:numPr>
+      </w:pPr>
+      <w:r>
+        <w:t>EI Table 1.7.1 — Resume Form</w:t>
+      </w:r>
+    </w:p>
+    <w:p>
+      <w:pPr>
+        <w:pStyle w:val="ListParagraph"/>
+        <w:numPr>
+          <w:ilvl w:val="2"/>
+          <w:numId w:val="2"/>
+        </w:numPr>
+      </w:pPr>
+      <w:r>
+        <w:t>(Note: The nested “Text Fields” and “Help Feature” components represent internal functional elements of the Resume Form component and are documented within the Resume Form EIT rather than receiving separate EITs.)</w:t>
+      </w:r>
+    </w:p>
+    <w:p>
+      <w:pPr>
+        <w:pStyle w:val="ListParagraph"/>
+        <w:numPr>
+          <w:ilvl w:val="3"/>
+          <w:numId w:val="2"/>
+        </w:numPr>
+      </w:pPr>
+      <w:r>
+        <w:t>Text Fields</w:t>
+      </w:r>
+    </w:p>
+    <w:p>
+      <w:pPr>
+        <w:pStyle w:val="ListParagraph"/>
+        <w:numPr>
+          <w:ilvl w:val="3"/>
+          <w:numId w:val="2"/>
+        </w:numPr>
+      </w:pPr>
+      <w:r>
+        <w:t>Help Feature</w:t>
+      </w:r>
+    </w:p>
+    <w:p>
+      <w:pPr>
+        <w:pStyle w:val="ListParagraph"/>
+        <w:numPr>
+          <w:ilvl w:val="1"/>
+          <w:numId w:val="2"/>
+        </w:numPr>
+      </w:pPr>
+      <w:r>
+        <w:t>EI Table 1.7.2 — Resume Repository</w:t>
+      </w:r>
+    </w:p>
+    <w:p>
+      <w:pPr>
+        <w:pStyle w:val="ListParagraph"/>
+        <w:numPr>
+          <w:ilvl w:val="2"/>
+          <w:numId w:val="2"/>
+        </w:numPr>
+      </w:pPr>
+      <w:r>
+        <w:t>(Note: The nested “User Tags” and “Resume Data” components represent internal data organization elements of the Resume Repository component and are documented within the Resume Repository EIT rather than receiving separate EITs.)</w:t>
+      </w:r>
+    </w:p>
+    <w:p>
+      <w:pPr>
+        <w:pStyle w:val="ListParagraph"/>
+        <w:numPr>
+          <w:ilvl w:val="3"/>
+          <w:numId w:val="2"/>
+        </w:numPr>
+      </w:pPr>
+      <w:r>
+        <w:t>User Tags</w:t>
+      </w:r>
+    </w:p>
+    <w:p>
+      <w:pPr>
+        <w:pStyle w:val="ListParagraph"/>
+        <w:numPr>
+          <w:ilvl w:val="3"/>
+          <w:numId w:val="2"/>
+        </w:numPr>
+      </w:pPr>
+      <w:r>
+        <w:t>Resume Data</w:t>
+      </w:r>
+    </w:p>
+    <w:p>
+      <w:pPr>
+        <w:pStyle w:val="ListParagraph"/>
+        <w:numPr>
+          <w:ilvl w:val="1"/>
+          <w:numId w:val="2"/>
+        </w:numPr>
+      </w:pPr>
+      <w:r>
+        <w:t>EI Table 1.7.3 — Submission Handler</w:t>
+      </w:r>
+    </w:p>
+    <w:p>
+      <w:pPr>
+        <w:pStyle w:val="ListParagraph"/>
+        <w:numPr>
+          <w:ilvl w:val="1"/>
+          <w:numId w:val="2"/>
+        </w:numPr>
+      </w:pPr>
+      <w:r>
+        <w:t>EI Table 1.7.4 — Resume List</w:t>
+      </w:r>
+    </w:p>
+    <w:p>
+      <w:pPr>
+        <w:pStyle w:val="ListParagraph"/>
+        <w:numPr>
+          <w:ilvl w:val="1"/>
+          <w:numId w:val="2"/>
+        </w:numPr>
+      </w:pPr>
+      <w:r>
+        <w:t>EI Table 1.7.5 — Validation Prompt</w:t>
+      </w:r>
+    </w:p>
+    <w:p>
+      <w:pPr>
+        <w:pStyle w:val="ListParagraph"/>
+        <w:numPr>
+          <w:ilvl w:val="1"/>
+          <w:numId w:val="2"/>
+        </w:numPr>
+      </w:pPr>
+      <w:r>
+        <w:t>EI Table 1.7.6 — Mandatory Fields</w:t>
+      </w:r>
+    </w:p>
+    <w:p>
+      <w:pPr>
+        <w:pStyle w:val="ListParagraph"/>
+        <w:numPr>
+          <w:ilvl w:val="0"/>
+          <w:numId w:val="2"/>
+        </w:numPr>
+      </w:pPr>
+      <w:r>
+        <w:t>Entity Identification Tables — Recommendation Service</w:t>
+      </w:r>
+      <w:r>
+        <w:t xml:space="preserve"> </w:t>
+      </w:r>
+      <w:r>
         <w:t>(</w:t>
       </w:r>
       <w:r>
-        <w:t>6</w:t>
+        <w:t>5</w:t>
       </w:r>
       <w:r>
         <w:t xml:space="preserve"> </w:t>
@@ -3809,190 +3733,6 @@
           <w:ilvl w:val="1"/>
           <w:numId w:val="2"/>
         </w:numPr>
-        <w:cnfStyle w:val="000000100000" w:firstRow="0" w:lastRow="0" w:firstColumn="0" w:lastColumn="0" w:oddVBand="0" w:evenVBand="0" w:oddHBand="1" w:evenHBand="0" w:firstRowFirstColumn="0" w:firstRowLastColumn="0" w:lastRowFirstColumn="0" w:lastRowLastColumn="0"/>
-      </w:pPr>
-      <w:r>
-        <w:t>EI Table 1.7.1 — Resume Form</w:t>
-      </w:r>
-    </w:p>
-    <w:p>
-      <w:pPr>
-        <w:pStyle w:val="ListParagraph"/>
-        <w:numPr>
-          <w:ilvl w:val="2"/>
-          <w:numId w:val="2"/>
-        </w:numPr>
-        <w:cnfStyle w:val="000000100000" w:firstRow="0" w:lastRow="0" w:firstColumn="0" w:lastColumn="0" w:oddVBand="0" w:evenVBand="0" w:oddHBand="1" w:evenHBand="0" w:firstRowFirstColumn="0" w:firstRowLastColumn="0" w:lastRowFirstColumn="0" w:lastRowLastColumn="0"/>
-      </w:pPr>
-      <w:r>
-        <w:t>(Note: The nested “Text Fields” and “Help Feature” components represent internal functional elements of the Resume Form component and are documented within the Resume Form EIT rather than receiving separate EITs.)</w:t>
-      </w:r>
-    </w:p>
-    <w:p>
-      <w:pPr>
-        <w:pStyle w:val="ListParagraph"/>
-        <w:numPr>
-          <w:ilvl w:val="3"/>
-          <w:numId w:val="2"/>
-        </w:numPr>
-        <w:cnfStyle w:val="000000100000" w:firstRow="0" w:lastRow="0" w:firstColumn="0" w:lastColumn="0" w:oddVBand="0" w:evenVBand="0" w:oddHBand="1" w:evenHBand="0" w:firstRowFirstColumn="0" w:firstRowLastColumn="0" w:lastRowFirstColumn="0" w:lastRowLastColumn="0"/>
-      </w:pPr>
-      <w:r>
-        <w:t>Text Fields</w:t>
-      </w:r>
-    </w:p>
-    <w:p>
-      <w:pPr>
-        <w:pStyle w:val="ListParagraph"/>
-        <w:numPr>
-          <w:ilvl w:val="3"/>
-          <w:numId w:val="2"/>
-        </w:numPr>
-        <w:cnfStyle w:val="000000100000" w:firstRow="0" w:lastRow="0" w:firstColumn="0" w:lastColumn="0" w:oddVBand="0" w:evenVBand="0" w:oddHBand="1" w:evenHBand="0" w:firstRowFirstColumn="0" w:firstRowLastColumn="0" w:lastRowFirstColumn="0" w:lastRowLastColumn="0"/>
-      </w:pPr>
-      <w:r>
-        <w:t>Help Feature</w:t>
-      </w:r>
-    </w:p>
-    <w:p>
-      <w:pPr>
-        <w:pStyle w:val="ListParagraph"/>
-        <w:numPr>
-          <w:ilvl w:val="1"/>
-          <w:numId w:val="2"/>
-        </w:numPr>
-        <w:cnfStyle w:val="000000100000" w:firstRow="0" w:lastRow="0" w:firstColumn="0" w:lastColumn="0" w:oddVBand="0" w:evenVBand="0" w:oddHBand="1" w:evenHBand="0" w:firstRowFirstColumn="0" w:firstRowLastColumn="0" w:lastRowFirstColumn="0" w:lastRowLastColumn="0"/>
-      </w:pPr>
-      <w:r>
-        <w:t>EI Table 1.7.2 — Resume Repository</w:t>
-      </w:r>
-    </w:p>
-    <w:p>
-      <w:pPr>
-        <w:pStyle w:val="ListParagraph"/>
-        <w:numPr>
-          <w:ilvl w:val="2"/>
-          <w:numId w:val="2"/>
-        </w:numPr>
-        <w:cnfStyle w:val="000000100000" w:firstRow="0" w:lastRow="0" w:firstColumn="0" w:lastColumn="0" w:oddVBand="0" w:evenVBand="0" w:oddHBand="1" w:evenHBand="0" w:firstRowFirstColumn="0" w:firstRowLastColumn="0" w:lastRowFirstColumn="0" w:lastRowLastColumn="0"/>
-      </w:pPr>
-      <w:r>
-        <w:t>(Note: The nested “User Tags” and “Resume Data” components represent internal data organization elements of the Resume Repository component and are documented within the Resume Repository EIT rather than receiving separate EITs.)</w:t>
-      </w:r>
-    </w:p>
-    <w:p>
-      <w:pPr>
-        <w:pStyle w:val="ListParagraph"/>
-        <w:numPr>
-          <w:ilvl w:val="3"/>
-          <w:numId w:val="2"/>
-        </w:numPr>
-        <w:cnfStyle w:val="000000100000" w:firstRow="0" w:lastRow="0" w:firstColumn="0" w:lastColumn="0" w:oddVBand="0" w:evenVBand="0" w:oddHBand="1" w:evenHBand="0" w:firstRowFirstColumn="0" w:firstRowLastColumn="0" w:lastRowFirstColumn="0" w:lastRowLastColumn="0"/>
-      </w:pPr>
-      <w:r>
-        <w:t>User Tags</w:t>
-      </w:r>
-    </w:p>
-    <w:p>
-      <w:pPr>
-        <w:pStyle w:val="ListParagraph"/>
-        <w:numPr>
-          <w:ilvl w:val="3"/>
-          <w:numId w:val="2"/>
-        </w:numPr>
-        <w:cnfStyle w:val="000000100000" w:firstRow="0" w:lastRow="0" w:firstColumn="0" w:lastColumn="0" w:oddVBand="0" w:evenVBand="0" w:oddHBand="1" w:evenHBand="0" w:firstRowFirstColumn="0" w:firstRowLastColumn="0" w:lastRowFirstColumn="0" w:lastRowLastColumn="0"/>
-      </w:pPr>
-      <w:r>
-        <w:t>Resume Data</w:t>
-      </w:r>
-    </w:p>
-    <w:p>
-      <w:pPr>
-        <w:pStyle w:val="ListParagraph"/>
-        <w:numPr>
-          <w:ilvl w:val="1"/>
-          <w:numId w:val="2"/>
-        </w:numPr>
-        <w:cnfStyle w:val="000000100000" w:firstRow="0" w:lastRow="0" w:firstColumn="0" w:lastColumn="0" w:oddVBand="0" w:evenVBand="0" w:oddHBand="1" w:evenHBand="0" w:firstRowFirstColumn="0" w:firstRowLastColumn="0" w:lastRowFirstColumn="0" w:lastRowLastColumn="0"/>
-      </w:pPr>
-      <w:r>
-        <w:t>EI Table 1.7.3 — Submission Handler</w:t>
-      </w:r>
-    </w:p>
-    <w:p>
-      <w:pPr>
-        <w:pStyle w:val="ListParagraph"/>
-        <w:numPr>
-          <w:ilvl w:val="1"/>
-          <w:numId w:val="2"/>
-        </w:numPr>
-        <w:cnfStyle w:val="000000100000" w:firstRow="0" w:lastRow="0" w:firstColumn="0" w:lastColumn="0" w:oddVBand="0" w:evenVBand="0" w:oddHBand="1" w:evenHBand="0" w:firstRowFirstColumn="0" w:firstRowLastColumn="0" w:lastRowFirstColumn="0" w:lastRowLastColumn="0"/>
-      </w:pPr>
-      <w:r>
-        <w:t>EI Table 1.7.4 — Resume List</w:t>
-      </w:r>
-    </w:p>
-    <w:p>
-      <w:pPr>
-        <w:pStyle w:val="ListParagraph"/>
-        <w:numPr>
-          <w:ilvl w:val="1"/>
-          <w:numId w:val="2"/>
-        </w:numPr>
-        <w:cnfStyle w:val="000000100000" w:firstRow="0" w:lastRow="0" w:firstColumn="0" w:lastColumn="0" w:oddVBand="0" w:evenVBand="0" w:oddHBand="1" w:evenHBand="0" w:firstRowFirstColumn="0" w:firstRowLastColumn="0" w:lastRowFirstColumn="0" w:lastRowLastColumn="0"/>
-      </w:pPr>
-      <w:r>
-        <w:t>EI Table 1.7.5 — Validation Prompt</w:t>
-      </w:r>
-    </w:p>
-    <w:p>
-      <w:pPr>
-        <w:pStyle w:val="ListParagraph"/>
-        <w:numPr>
-          <w:ilvl w:val="1"/>
-          <w:numId w:val="2"/>
-        </w:numPr>
-        <w:cnfStyle w:val="000000100000" w:firstRow="0" w:lastRow="0" w:firstColumn="0" w:lastColumn="0" w:oddVBand="0" w:evenVBand="0" w:oddHBand="1" w:evenHBand="0" w:firstRowFirstColumn="0" w:firstRowLastColumn="0" w:lastRowFirstColumn="0" w:lastRowLastColumn="0"/>
-      </w:pPr>
-      <w:r>
-        <w:t>EI Table 1.7.6 — Mandatory Fields</w:t>
-      </w:r>
-    </w:p>
-    <w:p>
-      <w:pPr>
-        <w:pStyle w:val="ListParagraph"/>
-        <w:numPr>
-          <w:ilvl w:val="0"/>
-          <w:numId w:val="2"/>
-        </w:numPr>
-      </w:pPr>
-      <w:r>
-        <w:t>Entity Identification Tables — Recommendation Service</w:t>
-      </w:r>
-      <w:r>
-        <w:t xml:space="preserve"> </w:t>
-      </w:r>
-      <w:r>
-        <w:t>(</w:t>
-      </w:r>
-      <w:r>
-        <w:t>5</w:t>
-      </w:r>
-      <w:r>
-        <w:t xml:space="preserve"> </w:t>
-      </w:r>
-      <w:r>
-        <w:t>Inner Components)</w:t>
-      </w:r>
-    </w:p>
-    <w:p>
-      <w:pPr>
-        <w:pStyle w:val="ListParagraph"/>
-        <w:numPr>
-          <w:ilvl w:val="1"/>
-          <w:numId w:val="2"/>
-        </w:numPr>
-        <w:cnfStyle w:val="000000100000" w:firstRow="0" w:lastRow="0" w:firstColumn="0" w:lastColumn="0" w:oddVBand="0" w:evenVBand="0" w:oddHBand="1" w:evenHBand="0" w:firstRowFirstColumn="0" w:firstRowLastColumn="0" w:lastRowFirstColumn="0" w:lastRowLastColumn="0"/>
       </w:pPr>
       <w:r>
         <w:t>EI Table 1.15.1 — Job Listing Index</w:t>
@@ -4005,7 +3745,6 @@
           <w:ilvl w:val="1"/>
           <w:numId w:val="2"/>
         </w:numPr>
-        <w:cnfStyle w:val="000000100000" w:firstRow="0" w:lastRow="0" w:firstColumn="0" w:lastColumn="0" w:oddVBand="0" w:evenVBand="0" w:oddHBand="1" w:evenHBand="0" w:firstRowFirstColumn="0" w:firstRowLastColumn="0" w:lastRowFirstColumn="0" w:lastRowLastColumn="0"/>
       </w:pPr>
       <w:r>
         <w:t>EI Table 1.15.2 — Candidate Recommendations for Companies</w:t>
@@ -4018,7 +3757,6 @@
           <w:ilvl w:val="1"/>
           <w:numId w:val="2"/>
         </w:numPr>
-        <w:cnfStyle w:val="000000100000" w:firstRow="0" w:lastRow="0" w:firstColumn="0" w:lastColumn="0" w:oddVBand="0" w:evenVBand="0" w:oddHBand="1" w:evenHBand="0" w:firstRowFirstColumn="0" w:firstRowLastColumn="0" w:lastRowFirstColumn="0" w:lastRowLastColumn="0"/>
       </w:pPr>
       <w:r>
         <w:t>EI Table 1.15.3 — Skills-Based Matching Between Job Posting &amp; Resumes</w:t>
@@ -4031,7 +3769,6 @@
           <w:ilvl w:val="1"/>
           <w:numId w:val="2"/>
         </w:numPr>
-        <w:cnfStyle w:val="000000100000" w:firstRow="0" w:lastRow="0" w:firstColumn="0" w:lastColumn="0" w:oddVBand="0" w:evenVBand="0" w:oddHBand="1" w:evenHBand="0" w:firstRowFirstColumn="0" w:firstRowLastColumn="0" w:lastRowFirstColumn="0" w:lastRowLastColumn="0"/>
       </w:pPr>
       <w:r>
         <w:t>EI Table 1.15.4 — Resume Listing Index</w:t>
@@ -4044,26 +3781,16 @@
           <w:ilvl w:val="1"/>
           <w:numId w:val="2"/>
         </w:numPr>
-        <w:cnfStyle w:val="000000100000" w:firstRow="0" w:lastRow="0" w:firstColumn="0" w:lastColumn="0" w:oddVBand="0" w:evenVBand="0" w:oddHBand="1" w:evenHBand="0" w:firstRowFirstColumn="0" w:firstRowLastColumn="0" w:lastRowFirstColumn="0" w:lastRowLastColumn="0"/>
       </w:pPr>
       <w:r>
         <w:t>EI Table 1.15.5 — Job Recommendations to Students</w:t>
       </w:r>
     </w:p>
-    <w:p>
-      <w:pPr>
-        <w:cnfStyle w:val="000000100000" w:firstRow="0" w:lastRow="0" w:firstColumn="0" w:lastColumn="0" w:oddVBand="0" w:evenVBand="0" w:oddHBand="1" w:evenHBand="0" w:firstRowFirstColumn="0" w:firstRowLastColumn="0" w:lastRowFirstColumn="0" w:lastRowLastColumn="0"/>
-      </w:pPr>
-    </w:p>
-    <w:p>
-      <w:pPr>
-        <w:cnfStyle w:val="000000100000" w:firstRow="0" w:lastRow="0" w:firstColumn="0" w:lastColumn="0" w:oddVBand="0" w:evenVBand="0" w:oddHBand="1" w:evenHBand="0" w:firstRowFirstColumn="0" w:firstRowLastColumn="0" w:lastRowFirstColumn="0" w:lastRowLastColumn="0"/>
-      </w:pPr>
-    </w:p>
+    <w:p/>
+    <w:p/>
     <w:p>
       <w:pPr>
         <w:ind w:left="187"/>
-        <w:cnfStyle w:val="000000100000" w:firstRow="0" w:lastRow="0" w:firstColumn="0" w:lastColumn="0" w:oddVBand="0" w:evenVBand="0" w:oddHBand="1" w:evenHBand="0" w:firstRowFirstColumn="0" w:firstRowLastColumn="0" w:lastRowFirstColumn="0" w:lastRowLastColumn="0"/>
       </w:pPr>
     </w:p>
     <w:sectPr>

</xml_diff>

<commit_message>
Fixed numbering errors affecting Teams 1, 5, & 6
</commit_message>
<xml_diff>
--- a/01_Standards/Milestone_3_Components/M3_EI_Table_Names_&_Assignments.docx
+++ b/01_Standards/Milestone_3_Components/M3_EI_Table_Names_&_Assignments.docx
@@ -2267,31 +2267,49 @@
         </w:numPr>
       </w:pPr>
       <w:r>
-        <w:t>EI Table 1.13.1 — Query Layer</w:t>
-      </w:r>
-    </w:p>
-    <w:p>
-      <w:pPr>
-        <w:pStyle w:val="ListParagraph"/>
-        <w:numPr>
-          <w:ilvl w:val="1"/>
-          <w:numId w:val="2"/>
-        </w:numPr>
-      </w:pPr>
-      <w:r>
-        <w:t>EI Table 1.13.2 — Data Layer</w:t>
-      </w:r>
-    </w:p>
-    <w:p>
-      <w:pPr>
-        <w:pStyle w:val="ListParagraph"/>
-        <w:numPr>
-          <w:ilvl w:val="1"/>
-          <w:numId w:val="2"/>
-        </w:numPr>
-      </w:pPr>
-      <w:r>
-        <w:t>EI Table 1.13.3 — Indexing Layer</w:t>
+        <w:t>EI Table 1.1</w:t>
+      </w:r>
+      <w:r>
+        <w:t>4</w:t>
+      </w:r>
+      <w:r>
+        <w:t>.1 — Query Layer</w:t>
+      </w:r>
+    </w:p>
+    <w:p>
+      <w:pPr>
+        <w:pStyle w:val="ListParagraph"/>
+        <w:numPr>
+          <w:ilvl w:val="1"/>
+          <w:numId w:val="2"/>
+        </w:numPr>
+      </w:pPr>
+      <w:r>
+        <w:t>EI Table 1.1</w:t>
+      </w:r>
+      <w:r>
+        <w:t>4</w:t>
+      </w:r>
+      <w:r>
+        <w:t>.2 — Data Layer</w:t>
+      </w:r>
+    </w:p>
+    <w:p>
+      <w:pPr>
+        <w:pStyle w:val="ListParagraph"/>
+        <w:numPr>
+          <w:ilvl w:val="1"/>
+          <w:numId w:val="2"/>
+        </w:numPr>
+      </w:pPr>
+      <w:r>
+        <w:t>EI Table 1.1</w:t>
+      </w:r>
+      <w:r>
+        <w:t>4</w:t>
+      </w:r>
+      <w:r>
+        <w:t>.3 — Indexing Layer</w:t>
       </w:r>
     </w:p>
     <w:p>
@@ -2324,31 +2342,49 @@
         </w:numPr>
       </w:pPr>
       <w:r>
-        <w:t>EI Table 1.14.1 — Upload / Validation Layer</w:t>
-      </w:r>
-    </w:p>
-    <w:p>
-      <w:pPr>
-        <w:pStyle w:val="ListParagraph"/>
-        <w:numPr>
-          <w:ilvl w:val="1"/>
-          <w:numId w:val="2"/>
-        </w:numPr>
-      </w:pPr>
-      <w:r>
-        <w:t>EI Table 1.14.2 — Raw Byte Storage</w:t>
-      </w:r>
-    </w:p>
-    <w:p>
-      <w:pPr>
-        <w:pStyle w:val="ListParagraph"/>
-        <w:numPr>
-          <w:ilvl w:val="1"/>
-          <w:numId w:val="2"/>
-        </w:numPr>
-      </w:pPr>
-      <w:r>
-        <w:t>EI Table 1.14.3 — Backup Module</w:t>
+        <w:t>EI Table 1.1</w:t>
+      </w:r>
+      <w:r>
+        <w:t>5</w:t>
+      </w:r>
+      <w:r>
+        <w:t>.1 — Upload / Validation Layer</w:t>
+      </w:r>
+    </w:p>
+    <w:p>
+      <w:pPr>
+        <w:pStyle w:val="ListParagraph"/>
+        <w:numPr>
+          <w:ilvl w:val="1"/>
+          <w:numId w:val="2"/>
+        </w:numPr>
+      </w:pPr>
+      <w:r>
+        <w:t>EI Table 1.1</w:t>
+      </w:r>
+      <w:r>
+        <w:t>5</w:t>
+      </w:r>
+      <w:r>
+        <w:t>.2 — Raw Byte Storage</w:t>
+      </w:r>
+    </w:p>
+    <w:p>
+      <w:pPr>
+        <w:pStyle w:val="ListParagraph"/>
+        <w:numPr>
+          <w:ilvl w:val="1"/>
+          <w:numId w:val="2"/>
+        </w:numPr>
+      </w:pPr>
+      <w:r>
+        <w:t>EI Table 1.1</w:t>
+      </w:r>
+      <w:r>
+        <w:t>5</w:t>
+      </w:r>
+      <w:r>
+        <w:t>.3 — Backup Module</w:t>
       </w:r>
     </w:p>
     <w:p>
@@ -3297,31 +3333,49 @@
         </w:numPr>
       </w:pPr>
       <w:r>
-        <w:t>EI Table 1.11.1 — USPS Address Validation Adapter</w:t>
-      </w:r>
-    </w:p>
-    <w:p>
-      <w:pPr>
-        <w:pStyle w:val="ListParagraph"/>
-        <w:numPr>
-          <w:ilvl w:val="1"/>
-          <w:numId w:val="2"/>
-        </w:numPr>
-      </w:pPr>
-      <w:r>
-        <w:t>EI Table 1.11.2 — Autocomplete API Adapter</w:t>
-      </w:r>
-    </w:p>
-    <w:p>
-      <w:pPr>
-        <w:pStyle w:val="ListParagraph"/>
-        <w:numPr>
-          <w:ilvl w:val="1"/>
-          <w:numId w:val="2"/>
-        </w:numPr>
-      </w:pPr>
-      <w:r>
-        <w:t>EI Table 1.11.3 — Push Notification Gateway</w:t>
+        <w:t>EI Table 1.1</w:t>
+      </w:r>
+      <w:r>
+        <w:t>2</w:t>
+      </w:r>
+      <w:r>
+        <w:t>.1 — USPS Address Validation Adapter</w:t>
+      </w:r>
+    </w:p>
+    <w:p>
+      <w:pPr>
+        <w:pStyle w:val="ListParagraph"/>
+        <w:numPr>
+          <w:ilvl w:val="1"/>
+          <w:numId w:val="2"/>
+        </w:numPr>
+      </w:pPr>
+      <w:r>
+        <w:t>EI Table 1.1</w:t>
+      </w:r>
+      <w:r>
+        <w:t>2</w:t>
+      </w:r>
+      <w:r>
+        <w:t>.2 — Autocomplete API Adapter</w:t>
+      </w:r>
+    </w:p>
+    <w:p>
+      <w:pPr>
+        <w:pStyle w:val="ListParagraph"/>
+        <w:numPr>
+          <w:ilvl w:val="1"/>
+          <w:numId w:val="2"/>
+        </w:numPr>
+      </w:pPr>
+      <w:r>
+        <w:t>EI Table 1.1</w:t>
+      </w:r>
+      <w:r>
+        <w:t>2</w:t>
+      </w:r>
+      <w:r>
+        <w:t>.3 — Push Notification Gateway</w:t>
       </w:r>
     </w:p>
     <w:p>
@@ -3360,55 +3414,85 @@
         </w:numPr>
       </w:pPr>
       <w:r>
-        <w:t>EI Table 1.12.1 — Job Posting Analytics</w:t>
-      </w:r>
-    </w:p>
-    <w:p>
-      <w:pPr>
-        <w:pStyle w:val="ListParagraph"/>
-        <w:numPr>
-          <w:ilvl w:val="1"/>
-          <w:numId w:val="2"/>
-        </w:numPr>
-      </w:pPr>
-      <w:r>
-        <w:t>EI Table 1.12.2 — Search and Candidate Analytics</w:t>
-      </w:r>
-    </w:p>
-    <w:p>
-      <w:pPr>
-        <w:pStyle w:val="ListParagraph"/>
-        <w:numPr>
-          <w:ilvl w:val="1"/>
-          <w:numId w:val="2"/>
-        </w:numPr>
-      </w:pPr>
-      <w:r>
-        <w:t>EI Table 1.12.3 — Profile and Resume Engagement</w:t>
-      </w:r>
-    </w:p>
-    <w:p>
-      <w:pPr>
-        <w:pStyle w:val="ListParagraph"/>
-        <w:numPr>
-          <w:ilvl w:val="1"/>
-          <w:numId w:val="2"/>
-        </w:numPr>
-      </w:pPr>
-      <w:r>
-        <w:t>EI Table 1.12.4 — Notification and News Feed Analytics</w:t>
-      </w:r>
-    </w:p>
-    <w:p>
-      <w:pPr>
-        <w:pStyle w:val="ListParagraph"/>
-        <w:numPr>
-          <w:ilvl w:val="1"/>
-          <w:numId w:val="2"/>
-        </w:numPr>
-      </w:pPr>
-      <w:r>
-        <w:t>EI Table 1.12.5 — Performance Monitor</w:t>
+        <w:t>EI Table 1.1</w:t>
+      </w:r>
+      <w:r>
+        <w:t>3</w:t>
+      </w:r>
+      <w:r>
+        <w:t>.1 — Job Posting Analytics</w:t>
+      </w:r>
+    </w:p>
+    <w:p>
+      <w:pPr>
+        <w:pStyle w:val="ListParagraph"/>
+        <w:numPr>
+          <w:ilvl w:val="1"/>
+          <w:numId w:val="2"/>
+        </w:numPr>
+      </w:pPr>
+      <w:r>
+        <w:t>EI Table 1.1</w:t>
+      </w:r>
+      <w:r>
+        <w:t>3</w:t>
+      </w:r>
+      <w:r>
+        <w:t>.2 — Search and Candidate Analytics</w:t>
+      </w:r>
+    </w:p>
+    <w:p>
+      <w:pPr>
+        <w:pStyle w:val="ListParagraph"/>
+        <w:numPr>
+          <w:ilvl w:val="1"/>
+          <w:numId w:val="2"/>
+        </w:numPr>
+      </w:pPr>
+      <w:r>
+        <w:t>EI Table 1.1</w:t>
+      </w:r>
+      <w:r>
+        <w:t>3</w:t>
+      </w:r>
+      <w:r>
+        <w:t>.3 — Profile and Resume Engagement</w:t>
+      </w:r>
+    </w:p>
+    <w:p>
+      <w:pPr>
+        <w:pStyle w:val="ListParagraph"/>
+        <w:numPr>
+          <w:ilvl w:val="1"/>
+          <w:numId w:val="2"/>
+        </w:numPr>
+      </w:pPr>
+      <w:r>
+        <w:t>EI Table 1.1</w:t>
+      </w:r>
+      <w:r>
+        <w:t>3</w:t>
+      </w:r>
+      <w:r>
+        <w:t>.4 — Notification and News Feed Analytics</w:t>
+      </w:r>
+    </w:p>
+    <w:p>
+      <w:pPr>
+        <w:pStyle w:val="ListParagraph"/>
+        <w:numPr>
+          <w:ilvl w:val="1"/>
+          <w:numId w:val="2"/>
+        </w:numPr>
+      </w:pPr>
+      <w:r>
+        <w:t>EI Table 1.1</w:t>
+      </w:r>
+      <w:r>
+        <w:t>3</w:t>
+      </w:r>
+      <w:r>
+        <w:t>.5 — Performance Monitor</w:t>
       </w:r>
     </w:p>
     <w:p>
@@ -3735,55 +3819,85 @@
         </w:numPr>
       </w:pPr>
       <w:r>
-        <w:t>EI Table 1.15.1 — Job Listing Index</w:t>
-      </w:r>
-    </w:p>
-    <w:p>
-      <w:pPr>
-        <w:pStyle w:val="ListParagraph"/>
-        <w:numPr>
-          <w:ilvl w:val="1"/>
-          <w:numId w:val="2"/>
-        </w:numPr>
-      </w:pPr>
-      <w:r>
-        <w:t>EI Table 1.15.2 — Candidate Recommendations for Companies</w:t>
-      </w:r>
-    </w:p>
-    <w:p>
-      <w:pPr>
-        <w:pStyle w:val="ListParagraph"/>
-        <w:numPr>
-          <w:ilvl w:val="1"/>
-          <w:numId w:val="2"/>
-        </w:numPr>
-      </w:pPr>
-      <w:r>
-        <w:t>EI Table 1.15.3 — Skills-Based Matching Between Job Posting &amp; Resumes</w:t>
-      </w:r>
-    </w:p>
-    <w:p>
-      <w:pPr>
-        <w:pStyle w:val="ListParagraph"/>
-        <w:numPr>
-          <w:ilvl w:val="1"/>
-          <w:numId w:val="2"/>
-        </w:numPr>
-      </w:pPr>
-      <w:r>
-        <w:t>EI Table 1.15.4 — Resume Listing Index</w:t>
-      </w:r>
-    </w:p>
-    <w:p>
-      <w:pPr>
-        <w:pStyle w:val="ListParagraph"/>
-        <w:numPr>
-          <w:ilvl w:val="1"/>
-          <w:numId w:val="2"/>
-        </w:numPr>
-      </w:pPr>
-      <w:r>
-        <w:t>EI Table 1.15.5 — Job Recommendations to Students</w:t>
+        <w:t>EI Table 1.1</w:t>
+      </w:r>
+      <w:r>
+        <w:t>1</w:t>
+      </w:r>
+      <w:r>
+        <w:t>.1 — Job Listing Index</w:t>
+      </w:r>
+    </w:p>
+    <w:p>
+      <w:pPr>
+        <w:pStyle w:val="ListParagraph"/>
+        <w:numPr>
+          <w:ilvl w:val="1"/>
+          <w:numId w:val="2"/>
+        </w:numPr>
+      </w:pPr>
+      <w:r>
+        <w:t>EI Table 1.1</w:t>
+      </w:r>
+      <w:r>
+        <w:t>1</w:t>
+      </w:r>
+      <w:r>
+        <w:t>.2 — Candidate Recommendations for Companies</w:t>
+      </w:r>
+    </w:p>
+    <w:p>
+      <w:pPr>
+        <w:pStyle w:val="ListParagraph"/>
+        <w:numPr>
+          <w:ilvl w:val="1"/>
+          <w:numId w:val="2"/>
+        </w:numPr>
+      </w:pPr>
+      <w:r>
+        <w:t>EI Table 1.1</w:t>
+      </w:r>
+      <w:r>
+        <w:t>1</w:t>
+      </w:r>
+      <w:r>
+        <w:t>.3 — Skills-Based Matching Between Job Posting &amp; Resumes</w:t>
+      </w:r>
+    </w:p>
+    <w:p>
+      <w:pPr>
+        <w:pStyle w:val="ListParagraph"/>
+        <w:numPr>
+          <w:ilvl w:val="1"/>
+          <w:numId w:val="2"/>
+        </w:numPr>
+      </w:pPr>
+      <w:r>
+        <w:t>EI Table 1.1</w:t>
+      </w:r>
+      <w:r>
+        <w:t>1</w:t>
+      </w:r>
+      <w:r>
+        <w:t>.4 — Resume Listing Index</w:t>
+      </w:r>
+    </w:p>
+    <w:p>
+      <w:pPr>
+        <w:pStyle w:val="ListParagraph"/>
+        <w:numPr>
+          <w:ilvl w:val="1"/>
+          <w:numId w:val="2"/>
+        </w:numPr>
+      </w:pPr>
+      <w:r>
+        <w:t>EI Table 1.1</w:t>
+      </w:r>
+      <w:r>
+        <w:t>1</w:t>
+      </w:r>
+      <w:r>
+        <w:t>.5 — Job Recommendations to Students</w:t>
       </w:r>
     </w:p>
     <w:p/>

</xml_diff>